<commit_message>
Interrupt and timer periphal support added
</commit_message>
<xml_diff>
--- a/hardware/docs/CS281_TRM.docx
+++ b/hardware/docs/CS281_TRM.docx
@@ -4975,7 +4975,7 @@
                 <w:sz w:val="18"/>
                 <w:szCs w:val="18"/>
               </w:rPr>
-              <w:t xml:space="preserve">Write 1 to Timer EV_PENDING (offset 0x18) to acknowledge.</w:t>
+              <w:t xml:space="preserve">Write 1 to Timer EV_PENDING (offset 0x3C) to acknowledge.</w:t>
             </w:r>
           </w:p>
         </w:tc>
@@ -7033,6 +7033,11 @@
     </w:p>
     <w:p>
       <w:pPr>
+        <w:spacing w:after="0" w:before="120"/>
+      </w:pPr>
+    </w:p>
+    <w:p>
+      <w:pPr>
         <w:spacing w:after="80" w:before="80"/>
       </w:pPr>
       <w:r>
@@ -7040,12 +7045,12 @@
           <w:sz w:val="20"/>
           <w:szCs w:val="20"/>
         </w:rPr>
-        <w:t xml:space="preserve">The hardware timer is a 32-bit countdown timer running at 100 MHz. It fires an interrupt (CPU line 11) when it counts down to zero. Use it for precise timing instead of busy-wait software delays.</w:t>
-      </w:r>
-    </w:p>
-    <w:p>
-      <w:pPr>
-        <w:spacing w:after="0" w:before="120"/>
+        <w:t xml:space="preserve">The LiteX_Timer is a 32-bit countdown timer running at 100 MHz. It counts down to zero and fires an interrupt on CPU line 11. Important: the peripheral uses an 8-bit CSR data width. The 32-bit LOAD and RELOAD values are each spread across four consecutive 8-bit sub-registers at 4-byte-aligned addresses, written most-significant byte first (sub-register 0 holds bits[31:24], sub-register 3 holds bits[7:0]). Single-bit control registers (EN, EV_PENDING, EV_ENABLE) each occupy one word.</w:t>
+      </w:r>
+    </w:p>
+    <w:p>
+      <w:pPr>
+        <w:spacing w:after="120" w:before="0"/>
       </w:pPr>
     </w:p>
     <w:p>
@@ -7190,7 +7195,7 @@
                 <w:sz w:val="18"/>
                 <w:szCs w:val="18"/>
               </w:rPr>
-              <w:t xml:space="preserve">Access</w:t>
+              <w:t xml:space="preserve">Width</w:t>
             </w:r>
           </w:p>
         </w:tc>
@@ -7279,11 +7284,11 @@
           <w:p>
             <w:r>
               <w:rPr>
-                <w:rFonts w:ascii="Arial" w:cs="Arial" w:eastAsia="Arial" w:hAnsi="Arial"/>
-                <w:sz w:val="18"/>
-                <w:szCs w:val="18"/>
-              </w:rPr>
-              <w:t xml:space="preserve">LOAD</w:t>
+                <w:rFonts w:ascii="Courier New" w:cs="Courier New" w:eastAsia="Courier New" w:hAnsi="Courier New"/>
+                <w:sz w:val="18"/>
+                <w:szCs w:val="18"/>
+              </w:rPr>
+              <w:t xml:space="preserve">LOAD0</w:t>
             </w:r>
           </w:p>
         </w:tc>
@@ -7307,11 +7312,10 @@
           <w:p>
             <w:r>
               <w:rPr>
-                <w:rFonts w:ascii="Arial" w:cs="Arial" w:eastAsia="Arial" w:hAnsi="Arial"/>
-                <w:sz w:val="18"/>
-                <w:szCs w:val="18"/>
-              </w:rPr>
-              <w:t xml:space="preserve">R / W</w:t>
+                <w:sz w:val="18"/>
+                <w:szCs w:val="18"/>
+              </w:rPr>
+              <w:t xml:space="preserve">8-bit W</w:t>
             </w:r>
           </w:p>
         </w:tc>
@@ -7335,11 +7339,10 @@
           <w:p>
             <w:r>
               <w:rPr>
-                <w:rFonts w:ascii="Arial" w:cs="Arial" w:eastAsia="Arial" w:hAnsi="Arial"/>
-                <w:sz w:val="18"/>
-                <w:szCs w:val="18"/>
-              </w:rPr>
-              <w:t xml:space="preserve">Load value. The timer counts down from this value when enabled.</w:t>
+                <w:sz w:val="18"/>
+                <w:szCs w:val="18"/>
+              </w:rPr>
+              <w:t xml:space="preserve">Countdown start value bits[31:24]  (MSB)</w:t>
             </w:r>
           </w:p>
         </w:tc>
@@ -7354,7 +7357,7 @@
               <w:bottom w:val="single" w:color="A0BDD4" w:sz="1"/>
               <w:right w:val="single" w:color="A0BDD4" w:sz="1"/>
             </w:tcBorders>
-            <w:shd w:fill="EEF4FB" w:val="clear"/>
+            <w:shd w:fill="D5E8F0" w:val="clear"/>
             <w:tcMar>
               <w:top w:type="dxa" w:w="80"/>
               <w:left w:type="dxa" w:w="120"/>
@@ -7382,22 +7385,22 @@
               <w:bottom w:val="single" w:color="A0BDD4" w:sz="1"/>
               <w:right w:val="single" w:color="A0BDD4" w:sz="1"/>
             </w:tcBorders>
-            <w:shd w:fill="EEF4FB" w:val="clear"/>
-            <w:tcMar>
-              <w:top w:type="dxa" w:w="80"/>
-              <w:left w:type="dxa" w:w="120"/>
-              <w:bottom w:type="dxa" w:w="80"/>
-              <w:right w:type="dxa" w:w="120"/>
-            </w:tcMar>
-          </w:tcPr>
-          <w:p>
-            <w:r>
-              <w:rPr>
-                <w:rFonts w:ascii="Arial" w:cs="Arial" w:eastAsia="Arial" w:hAnsi="Arial"/>
-                <w:sz w:val="18"/>
-                <w:szCs w:val="18"/>
-              </w:rPr>
-              <w:t xml:space="preserve">RELOAD</w:t>
+            <w:shd w:fill="D5E8F0" w:val="clear"/>
+            <w:tcMar>
+              <w:top w:type="dxa" w:w="80"/>
+              <w:left w:type="dxa" w:w="120"/>
+              <w:bottom w:type="dxa" w:w="80"/>
+              <w:right w:type="dxa" w:w="120"/>
+            </w:tcMar>
+          </w:tcPr>
+          <w:p>
+            <w:r>
+              <w:rPr>
+                <w:rFonts w:ascii="Courier New" w:cs="Courier New" w:eastAsia="Courier New" w:hAnsi="Courier New"/>
+                <w:sz w:val="18"/>
+                <w:szCs w:val="18"/>
+              </w:rPr>
+              <w:t xml:space="preserve">LOAD1</w:t>
             </w:r>
           </w:p>
         </w:tc>
@@ -7410,22 +7413,21 @@
               <w:bottom w:val="single" w:color="A0BDD4" w:sz="1"/>
               <w:right w:val="single" w:color="A0BDD4" w:sz="1"/>
             </w:tcBorders>
-            <w:shd w:fill="EEF4FB" w:val="clear"/>
-            <w:tcMar>
-              <w:top w:type="dxa" w:w="80"/>
-              <w:left w:type="dxa" w:w="120"/>
-              <w:bottom w:type="dxa" w:w="80"/>
-              <w:right w:type="dxa" w:w="120"/>
-            </w:tcMar>
-          </w:tcPr>
-          <w:p>
-            <w:r>
-              <w:rPr>
-                <w:rFonts w:ascii="Arial" w:cs="Arial" w:eastAsia="Arial" w:hAnsi="Arial"/>
-                <w:sz w:val="18"/>
-                <w:szCs w:val="18"/>
-              </w:rPr>
-              <w:t xml:space="preserve">R / W</w:t>
+            <w:shd w:fill="D5E8F0" w:val="clear"/>
+            <w:tcMar>
+              <w:top w:type="dxa" w:w="80"/>
+              <w:left w:type="dxa" w:w="120"/>
+              <w:bottom w:type="dxa" w:w="80"/>
+              <w:right w:type="dxa" w:w="120"/>
+            </w:tcMar>
+          </w:tcPr>
+          <w:p>
+            <w:r>
+              <w:rPr>
+                <w:sz w:val="18"/>
+                <w:szCs w:val="18"/>
+              </w:rPr>
+              <w:t xml:space="preserve">8-bit W</w:t>
             </w:r>
           </w:p>
         </w:tc>
@@ -7438,22 +7440,21 @@
               <w:bottom w:val="single" w:color="A0BDD4" w:sz="1"/>
               <w:right w:val="single" w:color="A0BDD4" w:sz="1"/>
             </w:tcBorders>
-            <w:shd w:fill="EEF4FB" w:val="clear"/>
-            <w:tcMar>
-              <w:top w:type="dxa" w:w="80"/>
-              <w:left w:type="dxa" w:w="120"/>
-              <w:bottom w:type="dxa" w:w="80"/>
-              <w:right w:type="dxa" w:w="120"/>
-            </w:tcMar>
-          </w:tcPr>
-          <w:p>
-            <w:r>
-              <w:rPr>
-                <w:rFonts w:ascii="Arial" w:cs="Arial" w:eastAsia="Arial" w:hAnsi="Arial"/>
-                <w:sz w:val="18"/>
-                <w:szCs w:val="18"/>
-              </w:rPr>
-              <w:t xml:space="preserve">Auto-reload value. On reaching zero the timer reloads from this register if non-zero; write 0 for one-shot mode.</w:t>
+            <w:shd w:fill="D5E8F0" w:val="clear"/>
+            <w:tcMar>
+              <w:top w:type="dxa" w:w="80"/>
+              <w:left w:type="dxa" w:w="120"/>
+              <w:bottom w:type="dxa" w:w="80"/>
+              <w:right w:type="dxa" w:w="120"/>
+            </w:tcMar>
+          </w:tcPr>
+          <w:p>
+            <w:r>
+              <w:rPr>
+                <w:sz w:val="18"/>
+                <w:szCs w:val="18"/>
+              </w:rPr>
+              <w:t xml:space="preserve">Countdown start value bits[23:16]</w:t>
             </w:r>
           </w:p>
         </w:tc>
@@ -7507,11 +7508,11 @@
           <w:p>
             <w:r>
               <w:rPr>
-                <w:rFonts w:ascii="Arial" w:cs="Arial" w:eastAsia="Arial" w:hAnsi="Arial"/>
-                <w:sz w:val="18"/>
-                <w:szCs w:val="18"/>
-              </w:rPr>
-              <w:t xml:space="preserve">EN</w:t>
+                <w:rFonts w:ascii="Courier New" w:cs="Courier New" w:eastAsia="Courier New" w:hAnsi="Courier New"/>
+                <w:sz w:val="18"/>
+                <w:szCs w:val="18"/>
+              </w:rPr>
+              <w:t xml:space="preserve">LOAD2</w:t>
             </w:r>
           </w:p>
         </w:tc>
@@ -7535,11 +7536,10 @@
           <w:p>
             <w:r>
               <w:rPr>
-                <w:rFonts w:ascii="Arial" w:cs="Arial" w:eastAsia="Arial" w:hAnsi="Arial"/>
-                <w:sz w:val="18"/>
-                <w:szCs w:val="18"/>
-              </w:rPr>
-              <w:t xml:space="preserve">R / W</w:t>
+                <w:sz w:val="18"/>
+                <w:szCs w:val="18"/>
+              </w:rPr>
+              <w:t xml:space="preserve">8-bit W</w:t>
             </w:r>
           </w:p>
         </w:tc>
@@ -7563,11 +7563,10 @@
           <w:p>
             <w:r>
               <w:rPr>
-                <w:rFonts w:ascii="Arial" w:cs="Arial" w:eastAsia="Arial" w:hAnsi="Arial"/>
-                <w:sz w:val="18"/>
-                <w:szCs w:val="18"/>
-              </w:rPr>
-              <w:t xml:space="preserve">Timer enable. Write 1 to start, 0 to stop.</w:t>
+                <w:sz w:val="18"/>
+                <w:szCs w:val="18"/>
+              </w:rPr>
+              <w:t xml:space="preserve">Countdown start value bits[15:8]</w:t>
             </w:r>
           </w:p>
         </w:tc>
@@ -7582,7 +7581,7 @@
               <w:bottom w:val="single" w:color="A0BDD4" w:sz="1"/>
               <w:right w:val="single" w:color="A0BDD4" w:sz="1"/>
             </w:tcBorders>
-            <w:shd w:fill="EEF4FB" w:val="clear"/>
+            <w:shd w:fill="D5E8F0" w:val="clear"/>
             <w:tcMar>
               <w:top w:type="dxa" w:w="80"/>
               <w:left w:type="dxa" w:w="120"/>
@@ -7610,22 +7609,22 @@
               <w:bottom w:val="single" w:color="A0BDD4" w:sz="1"/>
               <w:right w:val="single" w:color="A0BDD4" w:sz="1"/>
             </w:tcBorders>
-            <w:shd w:fill="EEF4FB" w:val="clear"/>
-            <w:tcMar>
-              <w:top w:type="dxa" w:w="80"/>
-              <w:left w:type="dxa" w:w="120"/>
-              <w:bottom w:type="dxa" w:w="80"/>
-              <w:right w:type="dxa" w:w="120"/>
-            </w:tcMar>
-          </w:tcPr>
-          <w:p>
-            <w:r>
-              <w:rPr>
-                <w:rFonts w:ascii="Arial" w:cs="Arial" w:eastAsia="Arial" w:hAnsi="Arial"/>
-                <w:sz w:val="18"/>
-                <w:szCs w:val="18"/>
-              </w:rPr>
-              <w:t xml:space="preserve">UPDATE_VALUE</w:t>
+            <w:shd w:fill="D5E8F0" w:val="clear"/>
+            <w:tcMar>
+              <w:top w:type="dxa" w:w="80"/>
+              <w:left w:type="dxa" w:w="120"/>
+              <w:bottom w:type="dxa" w:w="80"/>
+              <w:right w:type="dxa" w:w="120"/>
+            </w:tcMar>
+          </w:tcPr>
+          <w:p>
+            <w:r>
+              <w:rPr>
+                <w:rFonts w:ascii="Courier New" w:cs="Courier New" w:eastAsia="Courier New" w:hAnsi="Courier New"/>
+                <w:sz w:val="18"/>
+                <w:szCs w:val="18"/>
+              </w:rPr>
+              <w:t xml:space="preserve">LOAD3</w:t>
             </w:r>
           </w:p>
         </w:tc>
@@ -7638,22 +7637,21 @@
               <w:bottom w:val="single" w:color="A0BDD4" w:sz="1"/>
               <w:right w:val="single" w:color="A0BDD4" w:sz="1"/>
             </w:tcBorders>
-            <w:shd w:fill="EEF4FB" w:val="clear"/>
-            <w:tcMar>
-              <w:top w:type="dxa" w:w="80"/>
-              <w:left w:type="dxa" w:w="120"/>
-              <w:bottom w:type="dxa" w:w="80"/>
-              <w:right w:type="dxa" w:w="120"/>
-            </w:tcMar>
-          </w:tcPr>
-          <w:p>
-            <w:r>
-              <w:rPr>
-                <w:rFonts w:ascii="Arial" w:cs="Arial" w:eastAsia="Arial" w:hAnsi="Arial"/>
-                <w:sz w:val="18"/>
-                <w:szCs w:val="18"/>
-              </w:rPr>
-              <w:t xml:space="preserve">W</w:t>
+            <w:shd w:fill="D5E8F0" w:val="clear"/>
+            <w:tcMar>
+              <w:top w:type="dxa" w:w="80"/>
+              <w:left w:type="dxa" w:w="120"/>
+              <w:bottom w:type="dxa" w:w="80"/>
+              <w:right w:type="dxa" w:w="120"/>
+            </w:tcMar>
+          </w:tcPr>
+          <w:p>
+            <w:r>
+              <w:rPr>
+                <w:sz w:val="18"/>
+                <w:szCs w:val="18"/>
+              </w:rPr>
+              <w:t xml:space="preserve">8-bit W</w:t>
             </w:r>
           </w:p>
         </w:tc>
@@ -7666,22 +7664,21 @@
               <w:bottom w:val="single" w:color="A0BDD4" w:sz="1"/>
               <w:right w:val="single" w:color="A0BDD4" w:sz="1"/>
             </w:tcBorders>
-            <w:shd w:fill="EEF4FB" w:val="clear"/>
-            <w:tcMar>
-              <w:top w:type="dxa" w:w="80"/>
-              <w:left w:type="dxa" w:w="120"/>
-              <w:bottom w:type="dxa" w:w="80"/>
-              <w:right w:type="dxa" w:w="120"/>
-            </w:tcMar>
-          </w:tcPr>
-          <w:p>
-            <w:r>
-              <w:rPr>
-                <w:rFonts w:ascii="Arial" w:cs="Arial" w:eastAsia="Arial" w:hAnsi="Arial"/>
-                <w:sz w:val="18"/>
-                <w:szCs w:val="18"/>
-              </w:rPr>
-              <w:t xml:space="preserve">Write 1 to latch the current count into VALUE. Must be done before reading VALUE.</w:t>
+            <w:shd w:fill="D5E8F0" w:val="clear"/>
+            <w:tcMar>
+              <w:top w:type="dxa" w:w="80"/>
+              <w:left w:type="dxa" w:w="120"/>
+              <w:bottom w:type="dxa" w:w="80"/>
+              <w:right w:type="dxa" w:w="120"/>
+            </w:tcMar>
+          </w:tcPr>
+          <w:p>
+            <w:r>
+              <w:rPr>
+                <w:sz w:val="18"/>
+                <w:szCs w:val="18"/>
+              </w:rPr>
+              <w:t xml:space="preserve">Countdown start value bits[7:0]  (LSB). Write all four LOAD sub-registers before enabling the timer.</w:t>
             </w:r>
           </w:p>
         </w:tc>
@@ -7735,11 +7732,11 @@
           <w:p>
             <w:r>
               <w:rPr>
-                <w:rFonts w:ascii="Arial" w:cs="Arial" w:eastAsia="Arial" w:hAnsi="Arial"/>
-                <w:sz w:val="18"/>
-                <w:szCs w:val="18"/>
-              </w:rPr>
-              <w:t xml:space="preserve">VALUE</w:t>
+                <w:rFonts w:ascii="Courier New" w:cs="Courier New" w:eastAsia="Courier New" w:hAnsi="Courier New"/>
+                <w:sz w:val="18"/>
+                <w:szCs w:val="18"/>
+              </w:rPr>
+              <w:t xml:space="preserve">RELOAD0</w:t>
             </w:r>
           </w:p>
         </w:tc>
@@ -7763,11 +7760,10 @@
           <w:p>
             <w:r>
               <w:rPr>
-                <w:rFonts w:ascii="Arial" w:cs="Arial" w:eastAsia="Arial" w:hAnsi="Arial"/>
-                <w:sz w:val="18"/>
-                <w:szCs w:val="18"/>
-              </w:rPr>
-              <w:t xml:space="preserve">R</w:t>
+                <w:sz w:val="18"/>
+                <w:szCs w:val="18"/>
+              </w:rPr>
+              <w:t xml:space="preserve">8-bit W</w:t>
             </w:r>
           </w:p>
         </w:tc>
@@ -7791,11 +7787,10 @@
           <w:p>
             <w:r>
               <w:rPr>
-                <w:rFonts w:ascii="Arial" w:cs="Arial" w:eastAsia="Arial" w:hAnsi="Arial"/>
-                <w:sz w:val="18"/>
-                <w:szCs w:val="18"/>
-              </w:rPr>
-              <w:t xml:space="preserve">Latched current count. Read after writing 1 to UPDATE_VALUE.</w:t>
+                <w:sz w:val="18"/>
+                <w:szCs w:val="18"/>
+              </w:rPr>
+              <w:t xml:space="preserve">Auto-reload value bits[31:24]  (MSB). If RELOAD is non-zero the timer reloads automatically; write 0 for one-shot mode.</w:t>
             </w:r>
           </w:p>
         </w:tc>
@@ -7810,7 +7805,7 @@
               <w:bottom w:val="single" w:color="A0BDD4" w:sz="1"/>
               <w:right w:val="single" w:color="A0BDD4" w:sz="1"/>
             </w:tcBorders>
-            <w:shd w:fill="EEF4FB" w:val="clear"/>
+            <w:shd w:fill="D5E8F0" w:val="clear"/>
             <w:tcMar>
               <w:top w:type="dxa" w:w="80"/>
               <w:left w:type="dxa" w:w="120"/>
@@ -7838,22 +7833,22 @@
               <w:bottom w:val="single" w:color="A0BDD4" w:sz="1"/>
               <w:right w:val="single" w:color="A0BDD4" w:sz="1"/>
             </w:tcBorders>
-            <w:shd w:fill="EEF4FB" w:val="clear"/>
-            <w:tcMar>
-              <w:top w:type="dxa" w:w="80"/>
-              <w:left w:type="dxa" w:w="120"/>
-              <w:bottom w:type="dxa" w:w="80"/>
-              <w:right w:type="dxa" w:w="120"/>
-            </w:tcMar>
-          </w:tcPr>
-          <w:p>
-            <w:r>
-              <w:rPr>
-                <w:rFonts w:ascii="Arial" w:cs="Arial" w:eastAsia="Arial" w:hAnsi="Arial"/>
-                <w:sz w:val="18"/>
-                <w:szCs w:val="18"/>
-              </w:rPr>
-              <w:t xml:space="preserve">EV_STATUS</w:t>
+            <w:shd w:fill="D5E8F0" w:val="clear"/>
+            <w:tcMar>
+              <w:top w:type="dxa" w:w="80"/>
+              <w:left w:type="dxa" w:w="120"/>
+              <w:bottom w:type="dxa" w:w="80"/>
+              <w:right w:type="dxa" w:w="120"/>
+            </w:tcMar>
+          </w:tcPr>
+          <w:p>
+            <w:r>
+              <w:rPr>
+                <w:rFonts w:ascii="Courier New" w:cs="Courier New" w:eastAsia="Courier New" w:hAnsi="Courier New"/>
+                <w:sz w:val="18"/>
+                <w:szCs w:val="18"/>
+              </w:rPr>
+              <w:t xml:space="preserve">RELOAD1</w:t>
             </w:r>
           </w:p>
         </w:tc>
@@ -7866,22 +7861,21 @@
               <w:bottom w:val="single" w:color="A0BDD4" w:sz="1"/>
               <w:right w:val="single" w:color="A0BDD4" w:sz="1"/>
             </w:tcBorders>
-            <w:shd w:fill="EEF4FB" w:val="clear"/>
-            <w:tcMar>
-              <w:top w:type="dxa" w:w="80"/>
-              <w:left w:type="dxa" w:w="120"/>
-              <w:bottom w:type="dxa" w:w="80"/>
-              <w:right w:type="dxa" w:w="120"/>
-            </w:tcMar>
-          </w:tcPr>
-          <w:p>
-            <w:r>
-              <w:rPr>
-                <w:rFonts w:ascii="Arial" w:cs="Arial" w:eastAsia="Arial" w:hAnsi="Arial"/>
-                <w:sz w:val="18"/>
-                <w:szCs w:val="18"/>
-              </w:rPr>
-              <w:t xml:space="preserve">R</w:t>
+            <w:shd w:fill="D5E8F0" w:val="clear"/>
+            <w:tcMar>
+              <w:top w:type="dxa" w:w="80"/>
+              <w:left w:type="dxa" w:w="120"/>
+              <w:bottom w:type="dxa" w:w="80"/>
+              <w:right w:type="dxa" w:w="120"/>
+            </w:tcMar>
+          </w:tcPr>
+          <w:p>
+            <w:r>
+              <w:rPr>
+                <w:sz w:val="18"/>
+                <w:szCs w:val="18"/>
+              </w:rPr>
+              <w:t xml:space="preserve">8-bit W</w:t>
             </w:r>
           </w:p>
         </w:tc>
@@ -7894,22 +7888,21 @@
               <w:bottom w:val="single" w:color="A0BDD4" w:sz="1"/>
               <w:right w:val="single" w:color="A0BDD4" w:sz="1"/>
             </w:tcBorders>
-            <w:shd w:fill="EEF4FB" w:val="clear"/>
-            <w:tcMar>
-              <w:top w:type="dxa" w:w="80"/>
-              <w:left w:type="dxa" w:w="120"/>
-              <w:bottom w:type="dxa" w:w="80"/>
-              <w:right w:type="dxa" w:w="120"/>
-            </w:tcMar>
-          </w:tcPr>
-          <w:p>
-            <w:r>
-              <w:rPr>
-                <w:rFonts w:ascii="Arial" w:cs="Arial" w:eastAsia="Arial" w:hAnsi="Arial"/>
-                <w:sz w:val="18"/>
-                <w:szCs w:val="18"/>
-              </w:rPr>
-              <w:t xml:space="preserve">Raw timer interrupt status.</w:t>
+            <w:shd w:fill="D5E8F0" w:val="clear"/>
+            <w:tcMar>
+              <w:top w:type="dxa" w:w="80"/>
+              <w:left w:type="dxa" w:w="120"/>
+              <w:bottom w:type="dxa" w:w="80"/>
+              <w:right w:type="dxa" w:w="120"/>
+            </w:tcMar>
+          </w:tcPr>
+          <w:p>
+            <w:r>
+              <w:rPr>
+                <w:sz w:val="18"/>
+                <w:szCs w:val="18"/>
+              </w:rPr>
+              <w:t xml:space="preserve">Auto-reload value bits[23:16]</w:t>
             </w:r>
           </w:p>
         </w:tc>
@@ -7963,11 +7956,11 @@
           <w:p>
             <w:r>
               <w:rPr>
-                <w:rFonts w:ascii="Arial" w:cs="Arial" w:eastAsia="Arial" w:hAnsi="Arial"/>
-                <w:sz w:val="18"/>
-                <w:szCs w:val="18"/>
-              </w:rPr>
-              <w:t xml:space="preserve">EV_PENDING</w:t>
+                <w:rFonts w:ascii="Courier New" w:cs="Courier New" w:eastAsia="Courier New" w:hAnsi="Courier New"/>
+                <w:sz w:val="18"/>
+                <w:szCs w:val="18"/>
+              </w:rPr>
+              <w:t xml:space="preserve">RELOAD2</w:t>
             </w:r>
           </w:p>
         </w:tc>
@@ -7991,11 +7984,10 @@
           <w:p>
             <w:r>
               <w:rPr>
-                <w:rFonts w:ascii="Arial" w:cs="Arial" w:eastAsia="Arial" w:hAnsi="Arial"/>
-                <w:sz w:val="18"/>
-                <w:szCs w:val="18"/>
-              </w:rPr>
-              <w:t xml:space="preserve">R / W</w:t>
+                <w:sz w:val="18"/>
+                <w:szCs w:val="18"/>
+              </w:rPr>
+              <w:t xml:space="preserve">8-bit W</w:t>
             </w:r>
           </w:p>
         </w:tc>
@@ -8019,11 +8011,10 @@
           <w:p>
             <w:r>
               <w:rPr>
-                <w:rFonts w:ascii="Arial" w:cs="Arial" w:eastAsia="Arial" w:hAnsi="Arial"/>
-                <w:sz w:val="18"/>
-                <w:szCs w:val="18"/>
-              </w:rPr>
-              <w:t xml:space="preserve">Timer interrupt pending. Write 1 to clear (acknowledge) in your ISR.</w:t>
+                <w:sz w:val="18"/>
+                <w:szCs w:val="18"/>
+              </w:rPr>
+              <w:t xml:space="preserve">Auto-reload value bits[15:8]</w:t>
             </w:r>
           </w:p>
         </w:tc>
@@ -8038,7 +8029,7 @@
               <w:bottom w:val="single" w:color="A0BDD4" w:sz="1"/>
               <w:right w:val="single" w:color="A0BDD4" w:sz="1"/>
             </w:tcBorders>
-            <w:shd w:fill="EEF4FB" w:val="clear"/>
+            <w:shd w:fill="D5E8F0" w:val="clear"/>
             <w:tcMar>
               <w:top w:type="dxa" w:w="80"/>
               <w:left w:type="dxa" w:w="120"/>
@@ -8066,18 +8057,354 @@
               <w:bottom w:val="single" w:color="A0BDD4" w:sz="1"/>
               <w:right w:val="single" w:color="A0BDD4" w:sz="1"/>
             </w:tcBorders>
-            <w:shd w:fill="EEF4FB" w:val="clear"/>
-            <w:tcMar>
-              <w:top w:type="dxa" w:w="80"/>
-              <w:left w:type="dxa" w:w="120"/>
-              <w:bottom w:type="dxa" w:w="80"/>
-              <w:right w:type="dxa" w:w="120"/>
-            </w:tcMar>
-          </w:tcPr>
-          <w:p>
-            <w:r>
-              <w:rPr>
-                <w:rFonts w:ascii="Arial" w:cs="Arial" w:eastAsia="Arial" w:hAnsi="Arial"/>
+            <w:shd w:fill="D5E8F0" w:val="clear"/>
+            <w:tcMar>
+              <w:top w:type="dxa" w:w="80"/>
+              <w:left w:type="dxa" w:w="120"/>
+              <w:bottom w:type="dxa" w:w="80"/>
+              <w:right w:type="dxa" w:w="120"/>
+            </w:tcMar>
+          </w:tcPr>
+          <w:p>
+            <w:r>
+              <w:rPr>
+                <w:rFonts w:ascii="Courier New" w:cs="Courier New" w:eastAsia="Courier New" w:hAnsi="Courier New"/>
+                <w:sz w:val="18"/>
+                <w:szCs w:val="18"/>
+              </w:rPr>
+              <w:t xml:space="preserve">RELOAD3</w:t>
+            </w:r>
+          </w:p>
+        </w:tc>
+        <w:tc>
+          <w:tcPr>
+            <w:tcW w:type="dxa" w:w="960"/>
+            <w:tcBorders>
+              <w:top w:val="single" w:color="A0BDD4" w:sz="1"/>
+              <w:left w:val="single" w:color="A0BDD4" w:sz="1"/>
+              <w:bottom w:val="single" w:color="A0BDD4" w:sz="1"/>
+              <w:right w:val="single" w:color="A0BDD4" w:sz="1"/>
+            </w:tcBorders>
+            <w:shd w:fill="D5E8F0" w:val="clear"/>
+            <w:tcMar>
+              <w:top w:type="dxa" w:w="80"/>
+              <w:left w:type="dxa" w:w="120"/>
+              <w:bottom w:type="dxa" w:w="80"/>
+              <w:right w:type="dxa" w:w="120"/>
+            </w:tcMar>
+          </w:tcPr>
+          <w:p>
+            <w:r>
+              <w:rPr>
+                <w:sz w:val="18"/>
+                <w:szCs w:val="18"/>
+              </w:rPr>
+              <w:t xml:space="preserve">8-bit W</w:t>
+            </w:r>
+          </w:p>
+        </w:tc>
+        <w:tc>
+          <w:tcPr>
+            <w:tcW w:type="dxa" w:w="5480"/>
+            <w:tcBorders>
+              <w:top w:val="single" w:color="A0BDD4" w:sz="1"/>
+              <w:left w:val="single" w:color="A0BDD4" w:sz="1"/>
+              <w:bottom w:val="single" w:color="A0BDD4" w:sz="1"/>
+              <w:right w:val="single" w:color="A0BDD4" w:sz="1"/>
+            </w:tcBorders>
+            <w:shd w:fill="D5E8F0" w:val="clear"/>
+            <w:tcMar>
+              <w:top w:type="dxa" w:w="80"/>
+              <w:left w:type="dxa" w:w="120"/>
+              <w:bottom w:type="dxa" w:w="80"/>
+              <w:right w:type="dxa" w:w="120"/>
+            </w:tcMar>
+          </w:tcPr>
+          <w:p>
+            <w:r>
+              <w:rPr>
+                <w:sz w:val="18"/>
+                <w:szCs w:val="18"/>
+              </w:rPr>
+              <w:t xml:space="preserve">Auto-reload value bits[7:0]  (LSB)</w:t>
+            </w:r>
+          </w:p>
+        </w:tc>
+      </w:tr>
+      <w:tr>
+        <w:tc>
+          <w:tcPr>
+            <w:tcW w:type="dxa" w:w="960"/>
+            <w:tcBorders>
+              <w:top w:val="single" w:color="A0BDD4" w:sz="1"/>
+              <w:left w:val="single" w:color="A0BDD4" w:sz="1"/>
+              <w:bottom w:val="single" w:color="A0BDD4" w:sz="1"/>
+              <w:right w:val="single" w:color="A0BDD4" w:sz="1"/>
+            </w:tcBorders>
+            <w:shd w:fill="FFFFFF" w:val="clear"/>
+            <w:tcMar>
+              <w:top w:type="dxa" w:w="80"/>
+              <w:left w:type="dxa" w:w="120"/>
+              <w:bottom w:type="dxa" w:w="80"/>
+              <w:right w:type="dxa" w:w="120"/>
+            </w:tcMar>
+          </w:tcPr>
+          <w:p>
+            <w:r>
+              <w:rPr>
+                <w:rFonts w:ascii="Courier New" w:cs="Courier New" w:eastAsia="Courier New" w:hAnsi="Courier New"/>
+                <w:sz w:val="18"/>
+                <w:szCs w:val="18"/>
+              </w:rPr>
+              <w:t xml:space="preserve">0x20</w:t>
+            </w:r>
+          </w:p>
+        </w:tc>
+        <w:tc>
+          <w:tcPr>
+            <w:tcW w:type="dxa" w:w="1680"/>
+            <w:tcBorders>
+              <w:top w:val="single" w:color="A0BDD4" w:sz="1"/>
+              <w:left w:val="single" w:color="A0BDD4" w:sz="1"/>
+              <w:bottom w:val="single" w:color="A0BDD4" w:sz="1"/>
+              <w:right w:val="single" w:color="A0BDD4" w:sz="1"/>
+            </w:tcBorders>
+            <w:shd w:fill="FFFFFF" w:val="clear"/>
+            <w:tcMar>
+              <w:top w:type="dxa" w:w="80"/>
+              <w:left w:type="dxa" w:w="120"/>
+              <w:bottom w:type="dxa" w:w="80"/>
+              <w:right w:type="dxa" w:w="120"/>
+            </w:tcMar>
+          </w:tcPr>
+          <w:p>
+            <w:r>
+              <w:rPr>
+                <w:rFonts w:ascii="Courier New" w:cs="Courier New" w:eastAsia="Courier New" w:hAnsi="Courier New"/>
+                <w:sz w:val="18"/>
+                <w:szCs w:val="18"/>
+              </w:rPr>
+              <w:t xml:space="preserve">EN</w:t>
+            </w:r>
+          </w:p>
+        </w:tc>
+        <w:tc>
+          <w:tcPr>
+            <w:tcW w:type="dxa" w:w="960"/>
+            <w:tcBorders>
+              <w:top w:val="single" w:color="A0BDD4" w:sz="1"/>
+              <w:left w:val="single" w:color="A0BDD4" w:sz="1"/>
+              <w:bottom w:val="single" w:color="A0BDD4" w:sz="1"/>
+              <w:right w:val="single" w:color="A0BDD4" w:sz="1"/>
+            </w:tcBorders>
+            <w:shd w:fill="FFFFFF" w:val="clear"/>
+            <w:tcMar>
+              <w:top w:type="dxa" w:w="80"/>
+              <w:left w:type="dxa" w:w="120"/>
+              <w:bottom w:type="dxa" w:w="80"/>
+              <w:right w:type="dxa" w:w="120"/>
+            </w:tcMar>
+          </w:tcPr>
+          <w:p>
+            <w:r>
+              <w:rPr>
+                <w:sz w:val="18"/>
+                <w:szCs w:val="18"/>
+              </w:rPr>
+              <w:t xml:space="preserve">8-bit W</w:t>
+            </w:r>
+          </w:p>
+        </w:tc>
+        <w:tc>
+          <w:tcPr>
+            <w:tcW w:type="dxa" w:w="5480"/>
+            <w:tcBorders>
+              <w:top w:val="single" w:color="A0BDD4" w:sz="1"/>
+              <w:left w:val="single" w:color="A0BDD4" w:sz="1"/>
+              <w:bottom w:val="single" w:color="A0BDD4" w:sz="1"/>
+              <w:right w:val="single" w:color="A0BDD4" w:sz="1"/>
+            </w:tcBorders>
+            <w:shd w:fill="FFFFFF" w:val="clear"/>
+            <w:tcMar>
+              <w:top w:type="dxa" w:w="80"/>
+              <w:left w:type="dxa" w:w="120"/>
+              <w:bottom w:type="dxa" w:w="80"/>
+              <w:right w:type="dxa" w:w="120"/>
+            </w:tcMar>
+          </w:tcPr>
+          <w:p>
+            <w:r>
+              <w:rPr>
+                <w:sz w:val="18"/>
+                <w:szCs w:val="18"/>
+              </w:rPr>
+              <w:t xml:space="preserve">Timer enable. Write 1 to start counting, 0 to stop.</w:t>
+            </w:r>
+          </w:p>
+        </w:tc>
+      </w:tr>
+      <w:tr>
+        <w:tc>
+          <w:tcPr>
+            <w:tcW w:type="dxa" w:w="960"/>
+            <w:tcBorders>
+              <w:top w:val="single" w:color="A0BDD4" w:sz="1"/>
+              <w:left w:val="single" w:color="A0BDD4" w:sz="1"/>
+              <w:bottom w:val="single" w:color="A0BDD4" w:sz="1"/>
+              <w:right w:val="single" w:color="A0BDD4" w:sz="1"/>
+            </w:tcBorders>
+            <w:shd w:fill="D5E8F0" w:val="clear"/>
+            <w:tcMar>
+              <w:top w:type="dxa" w:w="80"/>
+              <w:left w:type="dxa" w:w="120"/>
+              <w:bottom w:type="dxa" w:w="80"/>
+              <w:right w:type="dxa" w:w="120"/>
+            </w:tcMar>
+          </w:tcPr>
+          <w:p>
+            <w:r>
+              <w:rPr>
+                <w:rFonts w:ascii="Courier New" w:cs="Courier New" w:eastAsia="Courier New" w:hAnsi="Courier New"/>
+                <w:sz w:val="18"/>
+                <w:szCs w:val="18"/>
+              </w:rPr>
+              <w:t xml:space="preserve">0x3C</w:t>
+            </w:r>
+          </w:p>
+        </w:tc>
+        <w:tc>
+          <w:tcPr>
+            <w:tcW w:type="dxa" w:w="1680"/>
+            <w:tcBorders>
+              <w:top w:val="single" w:color="A0BDD4" w:sz="1"/>
+              <w:left w:val="single" w:color="A0BDD4" w:sz="1"/>
+              <w:bottom w:val="single" w:color="A0BDD4" w:sz="1"/>
+              <w:right w:val="single" w:color="A0BDD4" w:sz="1"/>
+            </w:tcBorders>
+            <w:shd w:fill="D5E8F0" w:val="clear"/>
+            <w:tcMar>
+              <w:top w:type="dxa" w:w="80"/>
+              <w:left w:type="dxa" w:w="120"/>
+              <w:bottom w:type="dxa" w:w="80"/>
+              <w:right w:type="dxa" w:w="120"/>
+            </w:tcMar>
+          </w:tcPr>
+          <w:p>
+            <w:r>
+              <w:rPr>
+                <w:rFonts w:ascii="Courier New" w:cs="Courier New" w:eastAsia="Courier New" w:hAnsi="Courier New"/>
+                <w:sz w:val="18"/>
+                <w:szCs w:val="18"/>
+              </w:rPr>
+              <w:t xml:space="preserve">EV_PENDING</w:t>
+            </w:r>
+          </w:p>
+        </w:tc>
+        <w:tc>
+          <w:tcPr>
+            <w:tcW w:type="dxa" w:w="960"/>
+            <w:tcBorders>
+              <w:top w:val="single" w:color="A0BDD4" w:sz="1"/>
+              <w:left w:val="single" w:color="A0BDD4" w:sz="1"/>
+              <w:bottom w:val="single" w:color="A0BDD4" w:sz="1"/>
+              <w:right w:val="single" w:color="A0BDD4" w:sz="1"/>
+            </w:tcBorders>
+            <w:shd w:fill="D5E8F0" w:val="clear"/>
+            <w:tcMar>
+              <w:top w:type="dxa" w:w="80"/>
+              <w:left w:type="dxa" w:w="120"/>
+              <w:bottom w:type="dxa" w:w="80"/>
+              <w:right w:type="dxa" w:w="120"/>
+            </w:tcMar>
+          </w:tcPr>
+          <w:p>
+            <w:r>
+              <w:rPr>
+                <w:sz w:val="18"/>
+                <w:szCs w:val="18"/>
+              </w:rPr>
+              <w:t xml:space="preserve">8-bit RW</w:t>
+            </w:r>
+          </w:p>
+        </w:tc>
+        <w:tc>
+          <w:tcPr>
+            <w:tcW w:type="dxa" w:w="5480"/>
+            <w:tcBorders>
+              <w:top w:val="single" w:color="A0BDD4" w:sz="1"/>
+              <w:left w:val="single" w:color="A0BDD4" w:sz="1"/>
+              <w:bottom w:val="single" w:color="A0BDD4" w:sz="1"/>
+              <w:right w:val="single" w:color="A0BDD4" w:sz="1"/>
+            </w:tcBorders>
+            <w:shd w:fill="D5E8F0" w:val="clear"/>
+            <w:tcMar>
+              <w:top w:type="dxa" w:w="80"/>
+              <w:left w:type="dxa" w:w="120"/>
+              <w:bottom w:type="dxa" w:w="80"/>
+              <w:right w:type="dxa" w:w="120"/>
+            </w:tcMar>
+          </w:tcPr>
+          <w:p>
+            <w:r>
+              <w:rPr>
+                <w:sz w:val="18"/>
+                <w:szCs w:val="18"/>
+              </w:rPr>
+              <w:t xml:space="preserve">Interrupt pending flag. Write 1 in your ISR to clear (acknowledge) the interrupt. Failure to clear causes the CPU to re-enter the ISR immediately after mret.</w:t>
+            </w:r>
+          </w:p>
+        </w:tc>
+      </w:tr>
+      <w:tr>
+        <w:tc>
+          <w:tcPr>
+            <w:tcW w:type="dxa" w:w="960"/>
+            <w:tcBorders>
+              <w:top w:val="single" w:color="A0BDD4" w:sz="1"/>
+              <w:left w:val="single" w:color="A0BDD4" w:sz="1"/>
+              <w:bottom w:val="single" w:color="A0BDD4" w:sz="1"/>
+              <w:right w:val="single" w:color="A0BDD4" w:sz="1"/>
+            </w:tcBorders>
+            <w:shd w:fill="FFFFFF" w:val="clear"/>
+            <w:tcMar>
+              <w:top w:type="dxa" w:w="80"/>
+              <w:left w:type="dxa" w:w="120"/>
+              <w:bottom w:type="dxa" w:w="80"/>
+              <w:right w:type="dxa" w:w="120"/>
+            </w:tcMar>
+          </w:tcPr>
+          <w:p>
+            <w:r>
+              <w:rPr>
+                <w:rFonts w:ascii="Courier New" w:cs="Courier New" w:eastAsia="Courier New" w:hAnsi="Courier New"/>
+                <w:sz w:val="18"/>
+                <w:szCs w:val="18"/>
+              </w:rPr>
+              <w:t xml:space="preserve">0x40</w:t>
+            </w:r>
+          </w:p>
+        </w:tc>
+        <w:tc>
+          <w:tcPr>
+            <w:tcW w:type="dxa" w:w="1680"/>
+            <w:tcBorders>
+              <w:top w:val="single" w:color="A0BDD4" w:sz="1"/>
+              <w:left w:val="single" w:color="A0BDD4" w:sz="1"/>
+              <w:bottom w:val="single" w:color="A0BDD4" w:sz="1"/>
+              <w:right w:val="single" w:color="A0BDD4" w:sz="1"/>
+            </w:tcBorders>
+            <w:shd w:fill="FFFFFF" w:val="clear"/>
+            <w:tcMar>
+              <w:top w:type="dxa" w:w="80"/>
+              <w:left w:type="dxa" w:w="120"/>
+              <w:bottom w:type="dxa" w:w="80"/>
+              <w:right w:type="dxa" w:w="120"/>
+            </w:tcMar>
+          </w:tcPr>
+          <w:p>
+            <w:r>
+              <w:rPr>
+                <w:rFonts w:ascii="Courier New" w:cs="Courier New" w:eastAsia="Courier New" w:hAnsi="Courier New"/>
                 <w:sz w:val="18"/>
                 <w:szCs w:val="18"/>
               </w:rPr>
@@ -8094,22 +8421,21 @@
               <w:bottom w:val="single" w:color="A0BDD4" w:sz="1"/>
               <w:right w:val="single" w:color="A0BDD4" w:sz="1"/>
             </w:tcBorders>
-            <w:shd w:fill="EEF4FB" w:val="clear"/>
-            <w:tcMar>
-              <w:top w:type="dxa" w:w="80"/>
-              <w:left w:type="dxa" w:w="120"/>
-              <w:bottom w:type="dxa" w:w="80"/>
-              <w:right w:type="dxa" w:w="120"/>
-            </w:tcMar>
-          </w:tcPr>
-          <w:p>
-            <w:r>
-              <w:rPr>
-                <w:rFonts w:ascii="Arial" w:cs="Arial" w:eastAsia="Arial" w:hAnsi="Arial"/>
-                <w:sz w:val="18"/>
-                <w:szCs w:val="18"/>
-              </w:rPr>
-              <w:t xml:space="preserve">R / W</w:t>
+            <w:shd w:fill="FFFFFF" w:val="clear"/>
+            <w:tcMar>
+              <w:top w:type="dxa" w:w="80"/>
+              <w:left w:type="dxa" w:w="120"/>
+              <w:bottom w:type="dxa" w:w="80"/>
+              <w:right w:type="dxa" w:w="120"/>
+            </w:tcMar>
+          </w:tcPr>
+          <w:p>
+            <w:r>
+              <w:rPr>
+                <w:sz w:val="18"/>
+                <w:szCs w:val="18"/>
+              </w:rPr>
+              <w:t xml:space="preserve">8-bit W</w:t>
             </w:r>
           </w:p>
         </w:tc>
@@ -8122,22 +8448,21 @@
               <w:bottom w:val="single" w:color="A0BDD4" w:sz="1"/>
               <w:right w:val="single" w:color="A0BDD4" w:sz="1"/>
             </w:tcBorders>
-            <w:shd w:fill="EEF4FB" w:val="clear"/>
-            <w:tcMar>
-              <w:top w:type="dxa" w:w="80"/>
-              <w:left w:type="dxa" w:w="120"/>
-              <w:bottom w:type="dxa" w:w="80"/>
-              <w:right w:type="dxa" w:w="120"/>
-            </w:tcMar>
-          </w:tcPr>
-          <w:p>
-            <w:r>
-              <w:rPr>
-                <w:rFonts w:ascii="Arial" w:cs="Arial" w:eastAsia="Arial" w:hAnsi="Arial"/>
-                <w:sz w:val="18"/>
-                <w:szCs w:val="18"/>
-              </w:rPr>
-              <w:t xml:space="preserve">Write 1 to route timer interrupt to the CPU (enables CPU line 11).</w:t>
+            <w:shd w:fill="FFFFFF" w:val="clear"/>
+            <w:tcMar>
+              <w:top w:type="dxa" w:w="80"/>
+              <w:left w:type="dxa" w:w="120"/>
+              <w:bottom w:type="dxa" w:w="80"/>
+              <w:right w:type="dxa" w:w="120"/>
+            </w:tcMar>
+          </w:tcPr>
+          <w:p>
+            <w:r>
+              <w:rPr>
+                <w:sz w:val="18"/>
+                <w:szCs w:val="18"/>
+              </w:rPr>
+              <w:t xml:space="preserve">Write 1 to route the timer interrupt to CPU line 11. Write 0 to mask it.</w:t>
             </w:r>
           </w:p>
         </w:tc>
@@ -8151,140 +8476,1166 @@
     <w:p>
       <w:pPr>
         <w:pStyle w:val="Heading2"/>
-        <w:spacing w:after="120" w:before="240"/>
-      </w:pPr>
-      <w:r>
-        <w:rPr>
-          <w:rFonts w:ascii="Arial" w:cs="Arial" w:eastAsia="Arial" w:hAnsi="Arial"/>
+        <w:spacing w:after="60" w:before="180"/>
+      </w:pPr>
+      <w:r>
+        <w:t xml:space="preserve">6.1  Periodic Interrupt Timer — 1 second at 100 MHz</w:t>
+      </w:r>
+    </w:p>
+    <w:p>
+      <w:pPr>
+        <w:spacing w:after="80" w:before="0"/>
+      </w:pPr>
+    </w:p>
+    <w:p>
+      <w:pPr>
+        <w:spacing w:after="80" w:before="80"/>
+      </w:pPr>
+      <w:r>
+        <w:rPr>
+          <w:sz w:val="20"/>
+          <w:szCs w:val="20"/>
+        </w:rPr>
+        <w:t xml:space="preserve">Write LOAD and RELOAD byte-by-byte, MSB first. 100,000,000 = 0x05F5E100: byte 0 = 0x05, byte 1 = 0xF5, byte 2 = 0xE1, byte 3 = 0x00. Also configure mtvec, mie bit 11, and mstatus bit 3 (see Section 4.1) before enabling the timer.</w:t>
+      </w:r>
+    </w:p>
+    <w:p>
+      <w:pPr>
+        <w:spacing w:after="80" w:before="0"/>
+      </w:pPr>
+    </w:p>
+    <w:p>
+      <w:pPr>
+        <w:pBdr>
+          <w:top w:val="single" w:color="CCCCCC" w:sz="4" w:space="1"/>
+          <w:left w:val="single" w:color="CCCCCC" w:sz="4" w:space="4"/>
+          <w:bottom w:val="single" w:color="CCCCCC" w:sz="4" w:space="1"/>
+          <w:right w:val="single" w:color="CCCCCC" w:sz="4" w:space="4"/>
+        </w:pBdr>
+        <w:shd w:fill="F5F5F5" w:val="clear"/>
+        <w:spacing w:after="0" w:before="0"/>
+        <w:ind w:left="180"/>
+      </w:pPr>
+      <w:r>
+        <w:rPr>
+          <w:rFonts w:ascii="Courier New" w:cs="Courier New" w:eastAsia="Courier New" w:hAnsi="Courier New"/>
+          <w:color w:val="1F1F1F"/>
+          <w:sz w:val="18"/>
+          <w:szCs w:val="18"/>
+        </w:rPr>
+        <w:t xml:space="preserve">    li   t0, 0xe0002000</w:t>
+      </w:r>
+    </w:p>
+    <w:p>
+      <w:pPr>
+        <w:pBdr>
+          <w:top w:val="single" w:color="CCCCCC" w:sz="4" w:space="1"/>
+          <w:left w:val="single" w:color="CCCCCC" w:sz="4" w:space="4"/>
+          <w:bottom w:val="single" w:color="CCCCCC" w:sz="4" w:space="1"/>
+          <w:right w:val="single" w:color="CCCCCC" w:sz="4" w:space="4"/>
+        </w:pBdr>
+        <w:shd w:fill="F5F5F5" w:val="clear"/>
+        <w:spacing w:after="0" w:before="0"/>
+        <w:ind w:left="180"/>
+      </w:pPr>
+      <w:r>
+        <w:rPr>
+          <w:rFonts w:ascii="Courier New" w:cs="Courier New" w:eastAsia="Courier New" w:hAnsi="Courier New"/>
+          <w:color w:val="1F1F1F"/>
+          <w:sz w:val="18"/>
+          <w:szCs w:val="18"/>
+        </w:rPr>
+        <w:t xml:space="preserve"/>
+      </w:r>
+    </w:p>
+    <w:p>
+      <w:pPr>
+        <w:pBdr>
+          <w:top w:val="single" w:color="CCCCCC" w:sz="4" w:space="1"/>
+          <w:left w:val="single" w:color="CCCCCC" w:sz="4" w:space="4"/>
+          <w:bottom w:val="single" w:color="CCCCCC" w:sz="4" w:space="1"/>
+          <w:right w:val="single" w:color="CCCCCC" w:sz="4" w:space="4"/>
+        </w:pBdr>
+        <w:shd w:fill="F5F5F5" w:val="clear"/>
+        <w:spacing w:after="0" w:before="0"/>
+        <w:ind w:left="180"/>
+      </w:pPr>
+      <w:r>
+        <w:rPr>
+          <w:rFonts w:ascii="Courier New" w:cs="Courier New" w:eastAsia="Courier New" w:hAnsi="Courier New"/>
+          <w:color w:val="1F1F1F"/>
+          <w:sz w:val="18"/>
+          <w:szCs w:val="18"/>
+        </w:rPr>
+        <w:t xml:space="preserve">    # Enable interrupt routing</w:t>
+      </w:r>
+    </w:p>
+    <w:p>
+      <w:pPr>
+        <w:pBdr>
+          <w:top w:val="single" w:color="CCCCCC" w:sz="4" w:space="1"/>
+          <w:left w:val="single" w:color="CCCCCC" w:sz="4" w:space="4"/>
+          <w:bottom w:val="single" w:color="CCCCCC" w:sz="4" w:space="1"/>
+          <w:right w:val="single" w:color="CCCCCC" w:sz="4" w:space="4"/>
+        </w:pBdr>
+        <w:shd w:fill="F5F5F5" w:val="clear"/>
+        <w:spacing w:after="0" w:before="0"/>
+        <w:ind w:left="180"/>
+      </w:pPr>
+      <w:r>
+        <w:rPr>
+          <w:rFonts w:ascii="Courier New" w:cs="Courier New" w:eastAsia="Courier New" w:hAnsi="Courier New"/>
+          <w:color w:val="1F1F1F"/>
+          <w:sz w:val="18"/>
+          <w:szCs w:val="18"/>
+        </w:rPr>
+        <w:t xml:space="preserve">    li   t1, 1</w:t>
+      </w:r>
+    </w:p>
+    <w:p>
+      <w:pPr>
+        <w:pBdr>
+          <w:top w:val="single" w:color="CCCCCC" w:sz="4" w:space="1"/>
+          <w:left w:val="single" w:color="CCCCCC" w:sz="4" w:space="4"/>
+          <w:bottom w:val="single" w:color="CCCCCC" w:sz="4" w:space="1"/>
+          <w:right w:val="single" w:color="CCCCCC" w:sz="4" w:space="4"/>
+        </w:pBdr>
+        <w:shd w:fill="F5F5F5" w:val="clear"/>
+        <w:spacing w:after="0" w:before="0"/>
+        <w:ind w:left="180"/>
+      </w:pPr>
+      <w:r>
+        <w:rPr>
+          <w:rFonts w:ascii="Courier New" w:cs="Courier New" w:eastAsia="Courier New" w:hAnsi="Courier New"/>
+          <w:color w:val="1F1F1F"/>
+          <w:sz w:val="18"/>
+          <w:szCs w:val="18"/>
+        </w:rPr>
+        <w:t xml:space="preserve">    sw   t1, 0x40(t0)       # EV_ENABLE</w:t>
+      </w:r>
+    </w:p>
+    <w:p>
+      <w:pPr>
+        <w:pBdr>
+          <w:top w:val="single" w:color="CCCCCC" w:sz="4" w:space="1"/>
+          <w:left w:val="single" w:color="CCCCCC" w:sz="4" w:space="4"/>
+          <w:bottom w:val="single" w:color="CCCCCC" w:sz="4" w:space="1"/>
+          <w:right w:val="single" w:color="CCCCCC" w:sz="4" w:space="4"/>
+        </w:pBdr>
+        <w:shd w:fill="F5F5F5" w:val="clear"/>
+        <w:spacing w:after="0" w:before="0"/>
+        <w:ind w:left="180"/>
+      </w:pPr>
+      <w:r>
+        <w:rPr>
+          <w:rFonts w:ascii="Courier New" w:cs="Courier New" w:eastAsia="Courier New" w:hAnsi="Courier New"/>
+          <w:color w:val="1F1F1F"/>
+          <w:sz w:val="18"/>
+          <w:szCs w:val="18"/>
+        </w:rPr>
+        <w:t xml:space="preserve"/>
+      </w:r>
+    </w:p>
+    <w:p>
+      <w:pPr>
+        <w:pBdr>
+          <w:top w:val="single" w:color="CCCCCC" w:sz="4" w:space="1"/>
+          <w:left w:val="single" w:color="CCCCCC" w:sz="4" w:space="4"/>
+          <w:bottom w:val="single" w:color="CCCCCC" w:sz="4" w:space="1"/>
+          <w:right w:val="single" w:color="CCCCCC" w:sz="4" w:space="4"/>
+        </w:pBdr>
+        <w:shd w:fill="F5F5F5" w:val="clear"/>
+        <w:spacing w:after="0" w:before="0"/>
+        <w:ind w:left="180"/>
+      </w:pPr>
+      <w:r>
+        <w:rPr>
+          <w:rFonts w:ascii="Courier New" w:cs="Courier New" w:eastAsia="Courier New" w:hAnsi="Courier New"/>
+          <w:color w:val="1F1F1F"/>
+          <w:sz w:val="18"/>
+          <w:szCs w:val="18"/>
+        </w:rPr>
+        <w:t xml:space="preserve">    # Write LOAD: 100,000,000 = 0x05F5E100  (MSB first)</w:t>
+      </w:r>
+    </w:p>
+    <w:p>
+      <w:pPr>
+        <w:pBdr>
+          <w:top w:val="single" w:color="CCCCCC" w:sz="4" w:space="1"/>
+          <w:left w:val="single" w:color="CCCCCC" w:sz="4" w:space="4"/>
+          <w:bottom w:val="single" w:color="CCCCCC" w:sz="4" w:space="1"/>
+          <w:right w:val="single" w:color="CCCCCC" w:sz="4" w:space="4"/>
+        </w:pBdr>
+        <w:shd w:fill="F5F5F5" w:val="clear"/>
+        <w:spacing w:after="0" w:before="0"/>
+        <w:ind w:left="180"/>
+      </w:pPr>
+      <w:r>
+        <w:rPr>
+          <w:rFonts w:ascii="Courier New" w:cs="Courier New" w:eastAsia="Courier New" w:hAnsi="Courier New"/>
+          <w:color w:val="1F1F1F"/>
+          <w:sz w:val="18"/>
+          <w:szCs w:val="18"/>
+        </w:rPr>
+        <w:t xml:space="preserve">    li   t1, 0x05</w:t>
+      </w:r>
+    </w:p>
+    <w:p>
+      <w:pPr>
+        <w:pBdr>
+          <w:top w:val="single" w:color="CCCCCC" w:sz="4" w:space="1"/>
+          <w:left w:val="single" w:color="CCCCCC" w:sz="4" w:space="4"/>
+          <w:bottom w:val="single" w:color="CCCCCC" w:sz="4" w:space="1"/>
+          <w:right w:val="single" w:color="CCCCCC" w:sz="4" w:space="4"/>
+        </w:pBdr>
+        <w:shd w:fill="F5F5F5" w:val="clear"/>
+        <w:spacing w:after="0" w:before="0"/>
+        <w:ind w:left="180"/>
+      </w:pPr>
+      <w:r>
+        <w:rPr>
+          <w:rFonts w:ascii="Courier New" w:cs="Courier New" w:eastAsia="Courier New" w:hAnsi="Courier New"/>
+          <w:color w:val="1F1F1F"/>
+          <w:sz w:val="18"/>
+          <w:szCs w:val="18"/>
+        </w:rPr>
+        <w:t xml:space="preserve">    sw   t1, 0x00(t0)       # LOAD0: bits[31:24]</w:t>
+      </w:r>
+    </w:p>
+    <w:p>
+      <w:pPr>
+        <w:pBdr>
+          <w:top w:val="single" w:color="CCCCCC" w:sz="4" w:space="1"/>
+          <w:left w:val="single" w:color="CCCCCC" w:sz="4" w:space="4"/>
+          <w:bottom w:val="single" w:color="CCCCCC" w:sz="4" w:space="1"/>
+          <w:right w:val="single" w:color="CCCCCC" w:sz="4" w:space="4"/>
+        </w:pBdr>
+        <w:shd w:fill="F5F5F5" w:val="clear"/>
+        <w:spacing w:after="0" w:before="0"/>
+        <w:ind w:left="180"/>
+      </w:pPr>
+      <w:r>
+        <w:rPr>
+          <w:rFonts w:ascii="Courier New" w:cs="Courier New" w:eastAsia="Courier New" w:hAnsi="Courier New"/>
+          <w:color w:val="1F1F1F"/>
+          <w:sz w:val="18"/>
+          <w:szCs w:val="18"/>
+        </w:rPr>
+        <w:t xml:space="preserve">    li   t1, 0xF5</w:t>
+      </w:r>
+    </w:p>
+    <w:p>
+      <w:pPr>
+        <w:pBdr>
+          <w:top w:val="single" w:color="CCCCCC" w:sz="4" w:space="1"/>
+          <w:left w:val="single" w:color="CCCCCC" w:sz="4" w:space="4"/>
+          <w:bottom w:val="single" w:color="CCCCCC" w:sz="4" w:space="1"/>
+          <w:right w:val="single" w:color="CCCCCC" w:sz="4" w:space="4"/>
+        </w:pBdr>
+        <w:shd w:fill="F5F5F5" w:val="clear"/>
+        <w:spacing w:after="0" w:before="0"/>
+        <w:ind w:left="180"/>
+      </w:pPr>
+      <w:r>
+        <w:rPr>
+          <w:rFonts w:ascii="Courier New" w:cs="Courier New" w:eastAsia="Courier New" w:hAnsi="Courier New"/>
+          <w:color w:val="1F1F1F"/>
+          <w:sz w:val="18"/>
+          <w:szCs w:val="18"/>
+        </w:rPr>
+        <w:t xml:space="preserve">    sw   t1, 0x04(t0)       # LOAD1: bits[23:16]</w:t>
+      </w:r>
+    </w:p>
+    <w:p>
+      <w:pPr>
+        <w:pBdr>
+          <w:top w:val="single" w:color="CCCCCC" w:sz="4" w:space="1"/>
+          <w:left w:val="single" w:color="CCCCCC" w:sz="4" w:space="4"/>
+          <w:bottom w:val="single" w:color="CCCCCC" w:sz="4" w:space="1"/>
+          <w:right w:val="single" w:color="CCCCCC" w:sz="4" w:space="4"/>
+        </w:pBdr>
+        <w:shd w:fill="F5F5F5" w:val="clear"/>
+        <w:spacing w:after="0" w:before="0"/>
+        <w:ind w:left="180"/>
+      </w:pPr>
+      <w:r>
+        <w:rPr>
+          <w:rFonts w:ascii="Courier New" w:cs="Courier New" w:eastAsia="Courier New" w:hAnsi="Courier New"/>
+          <w:color w:val="1F1F1F"/>
+          <w:sz w:val="18"/>
+          <w:szCs w:val="18"/>
+        </w:rPr>
+        <w:t xml:space="preserve">    li   t1, 0xE1</w:t>
+      </w:r>
+    </w:p>
+    <w:p>
+      <w:pPr>
+        <w:pBdr>
+          <w:top w:val="single" w:color="CCCCCC" w:sz="4" w:space="1"/>
+          <w:left w:val="single" w:color="CCCCCC" w:sz="4" w:space="4"/>
+          <w:bottom w:val="single" w:color="CCCCCC" w:sz="4" w:space="1"/>
+          <w:right w:val="single" w:color="CCCCCC" w:sz="4" w:space="4"/>
+        </w:pBdr>
+        <w:shd w:fill="F5F5F5" w:val="clear"/>
+        <w:spacing w:after="0" w:before="0"/>
+        <w:ind w:left="180"/>
+      </w:pPr>
+      <w:r>
+        <w:rPr>
+          <w:rFonts w:ascii="Courier New" w:cs="Courier New" w:eastAsia="Courier New" w:hAnsi="Courier New"/>
+          <w:color w:val="1F1F1F"/>
+          <w:sz w:val="18"/>
+          <w:szCs w:val="18"/>
+        </w:rPr>
+        <w:t xml:space="preserve">    sw   t1, 0x08(t0)       # LOAD2: bits[15:8]</w:t>
+      </w:r>
+    </w:p>
+    <w:p>
+      <w:pPr>
+        <w:pBdr>
+          <w:top w:val="single" w:color="CCCCCC" w:sz="4" w:space="1"/>
+          <w:left w:val="single" w:color="CCCCCC" w:sz="4" w:space="4"/>
+          <w:bottom w:val="single" w:color="CCCCCC" w:sz="4" w:space="1"/>
+          <w:right w:val="single" w:color="CCCCCC" w:sz="4" w:space="4"/>
+        </w:pBdr>
+        <w:shd w:fill="F5F5F5" w:val="clear"/>
+        <w:spacing w:after="0" w:before="0"/>
+        <w:ind w:left="180"/>
+      </w:pPr>
+      <w:r>
+        <w:rPr>
+          <w:rFonts w:ascii="Courier New" w:cs="Courier New" w:eastAsia="Courier New" w:hAnsi="Courier New"/>
+          <w:color w:val="1F1F1F"/>
+          <w:sz w:val="18"/>
+          <w:szCs w:val="18"/>
+        </w:rPr>
+        <w:t xml:space="preserve">    sw   x0, 0x0C(t0)       # LOAD3: bits[7:0]  = 0</w:t>
+      </w:r>
+    </w:p>
+    <w:p>
+      <w:pPr>
+        <w:pBdr>
+          <w:top w:val="single" w:color="CCCCCC" w:sz="4" w:space="1"/>
+          <w:left w:val="single" w:color="CCCCCC" w:sz="4" w:space="4"/>
+          <w:bottom w:val="single" w:color="CCCCCC" w:sz="4" w:space="1"/>
+          <w:right w:val="single" w:color="CCCCCC" w:sz="4" w:space="4"/>
+        </w:pBdr>
+        <w:shd w:fill="F5F5F5" w:val="clear"/>
+        <w:spacing w:after="0" w:before="0"/>
+        <w:ind w:left="180"/>
+      </w:pPr>
+      <w:r>
+        <w:rPr>
+          <w:rFonts w:ascii="Courier New" w:cs="Courier New" w:eastAsia="Courier New" w:hAnsi="Courier New"/>
+          <w:color w:val="1F1F1F"/>
+          <w:sz w:val="18"/>
+          <w:szCs w:val="18"/>
+        </w:rPr>
+        <w:t xml:space="preserve"/>
+      </w:r>
+    </w:p>
+    <w:p>
+      <w:pPr>
+        <w:pBdr>
+          <w:top w:val="single" w:color="CCCCCC" w:sz="4" w:space="1"/>
+          <w:left w:val="single" w:color="CCCCCC" w:sz="4" w:space="4"/>
+          <w:bottom w:val="single" w:color="CCCCCC" w:sz="4" w:space="1"/>
+          <w:right w:val="single" w:color="CCCCCC" w:sz="4" w:space="4"/>
+        </w:pBdr>
+        <w:shd w:fill="F5F5F5" w:val="clear"/>
+        <w:spacing w:after="0" w:before="0"/>
+        <w:ind w:left="180"/>
+      </w:pPr>
+      <w:r>
+        <w:rPr>
+          <w:rFonts w:ascii="Courier New" w:cs="Courier New" w:eastAsia="Courier New" w:hAnsi="Courier New"/>
+          <w:color w:val="1F1F1F"/>
+          <w:sz w:val="18"/>
+          <w:szCs w:val="18"/>
+        </w:rPr>
+        <w:t xml:space="preserve">    # Write RELOAD (same values — repeats every second)</w:t>
+      </w:r>
+    </w:p>
+    <w:p>
+      <w:pPr>
+        <w:pBdr>
+          <w:top w:val="single" w:color="CCCCCC" w:sz="4" w:space="1"/>
+          <w:left w:val="single" w:color="CCCCCC" w:sz="4" w:space="4"/>
+          <w:bottom w:val="single" w:color="CCCCCC" w:sz="4" w:space="1"/>
+          <w:right w:val="single" w:color="CCCCCC" w:sz="4" w:space="4"/>
+        </w:pBdr>
+        <w:shd w:fill="F5F5F5" w:val="clear"/>
+        <w:spacing w:after="0" w:before="0"/>
+        <w:ind w:left="180"/>
+      </w:pPr>
+      <w:r>
+        <w:rPr>
+          <w:rFonts w:ascii="Courier New" w:cs="Courier New" w:eastAsia="Courier New" w:hAnsi="Courier New"/>
+          <w:color w:val="1F1F1F"/>
+          <w:sz w:val="18"/>
+          <w:szCs w:val="18"/>
+        </w:rPr>
+        <w:t xml:space="preserve">    li   t1, 0x05</w:t>
+      </w:r>
+    </w:p>
+    <w:p>
+      <w:pPr>
+        <w:pBdr>
+          <w:top w:val="single" w:color="CCCCCC" w:sz="4" w:space="1"/>
+          <w:left w:val="single" w:color="CCCCCC" w:sz="4" w:space="4"/>
+          <w:bottom w:val="single" w:color="CCCCCC" w:sz="4" w:space="1"/>
+          <w:right w:val="single" w:color="CCCCCC" w:sz="4" w:space="4"/>
+        </w:pBdr>
+        <w:shd w:fill="F5F5F5" w:val="clear"/>
+        <w:spacing w:after="0" w:before="0"/>
+        <w:ind w:left="180"/>
+      </w:pPr>
+      <w:r>
+        <w:rPr>
+          <w:rFonts w:ascii="Courier New" w:cs="Courier New" w:eastAsia="Courier New" w:hAnsi="Courier New"/>
+          <w:color w:val="1F1F1F"/>
+          <w:sz w:val="18"/>
+          <w:szCs w:val="18"/>
+        </w:rPr>
+        <w:t xml:space="preserve">    sw   t1, 0x10(t0)       # RELOAD0</w:t>
+      </w:r>
+    </w:p>
+    <w:p>
+      <w:pPr>
+        <w:pBdr>
+          <w:top w:val="single" w:color="CCCCCC" w:sz="4" w:space="1"/>
+          <w:left w:val="single" w:color="CCCCCC" w:sz="4" w:space="4"/>
+          <w:bottom w:val="single" w:color="CCCCCC" w:sz="4" w:space="1"/>
+          <w:right w:val="single" w:color="CCCCCC" w:sz="4" w:space="4"/>
+        </w:pBdr>
+        <w:shd w:fill="F5F5F5" w:val="clear"/>
+        <w:spacing w:after="0" w:before="0"/>
+        <w:ind w:left="180"/>
+      </w:pPr>
+      <w:r>
+        <w:rPr>
+          <w:rFonts w:ascii="Courier New" w:cs="Courier New" w:eastAsia="Courier New" w:hAnsi="Courier New"/>
+          <w:color w:val="1F1F1F"/>
+          <w:sz w:val="18"/>
+          <w:szCs w:val="18"/>
+        </w:rPr>
+        <w:t xml:space="preserve">    li   t1, 0xF5</w:t>
+      </w:r>
+    </w:p>
+    <w:p>
+      <w:pPr>
+        <w:pBdr>
+          <w:top w:val="single" w:color="CCCCCC" w:sz="4" w:space="1"/>
+          <w:left w:val="single" w:color="CCCCCC" w:sz="4" w:space="4"/>
+          <w:bottom w:val="single" w:color="CCCCCC" w:sz="4" w:space="1"/>
+          <w:right w:val="single" w:color="CCCCCC" w:sz="4" w:space="4"/>
+        </w:pBdr>
+        <w:shd w:fill="F5F5F5" w:val="clear"/>
+        <w:spacing w:after="0" w:before="0"/>
+        <w:ind w:left="180"/>
+      </w:pPr>
+      <w:r>
+        <w:rPr>
+          <w:rFonts w:ascii="Courier New" w:cs="Courier New" w:eastAsia="Courier New" w:hAnsi="Courier New"/>
+          <w:color w:val="1F1F1F"/>
+          <w:sz w:val="18"/>
+          <w:szCs w:val="18"/>
+        </w:rPr>
+        <w:t xml:space="preserve">    sw   t1, 0x14(t0)       # RELOAD1</w:t>
+      </w:r>
+    </w:p>
+    <w:p>
+      <w:pPr>
+        <w:pBdr>
+          <w:top w:val="single" w:color="CCCCCC" w:sz="4" w:space="1"/>
+          <w:left w:val="single" w:color="CCCCCC" w:sz="4" w:space="4"/>
+          <w:bottom w:val="single" w:color="CCCCCC" w:sz="4" w:space="1"/>
+          <w:right w:val="single" w:color="CCCCCC" w:sz="4" w:space="4"/>
+        </w:pBdr>
+        <w:shd w:fill="F5F5F5" w:val="clear"/>
+        <w:spacing w:after="0" w:before="0"/>
+        <w:ind w:left="180"/>
+      </w:pPr>
+      <w:r>
+        <w:rPr>
+          <w:rFonts w:ascii="Courier New" w:cs="Courier New" w:eastAsia="Courier New" w:hAnsi="Courier New"/>
+          <w:color w:val="1F1F1F"/>
+          <w:sz w:val="18"/>
+          <w:szCs w:val="18"/>
+        </w:rPr>
+        <w:t xml:space="preserve">    li   t1, 0xE1</w:t>
+      </w:r>
+    </w:p>
+    <w:p>
+      <w:pPr>
+        <w:pBdr>
+          <w:top w:val="single" w:color="CCCCCC" w:sz="4" w:space="1"/>
+          <w:left w:val="single" w:color="CCCCCC" w:sz="4" w:space="4"/>
+          <w:bottom w:val="single" w:color="CCCCCC" w:sz="4" w:space="1"/>
+          <w:right w:val="single" w:color="CCCCCC" w:sz="4" w:space="4"/>
+        </w:pBdr>
+        <w:shd w:fill="F5F5F5" w:val="clear"/>
+        <w:spacing w:after="0" w:before="0"/>
+        <w:ind w:left="180"/>
+      </w:pPr>
+      <w:r>
+        <w:rPr>
+          <w:rFonts w:ascii="Courier New" w:cs="Courier New" w:eastAsia="Courier New" w:hAnsi="Courier New"/>
+          <w:color w:val="1F1F1F"/>
+          <w:sz w:val="18"/>
+          <w:szCs w:val="18"/>
+        </w:rPr>
+        <w:t xml:space="preserve">    sw   t1, 0x18(t0)       # RELOAD2</w:t>
+      </w:r>
+    </w:p>
+    <w:p>
+      <w:pPr>
+        <w:pBdr>
+          <w:top w:val="single" w:color="CCCCCC" w:sz="4" w:space="1"/>
+          <w:left w:val="single" w:color="CCCCCC" w:sz="4" w:space="4"/>
+          <w:bottom w:val="single" w:color="CCCCCC" w:sz="4" w:space="1"/>
+          <w:right w:val="single" w:color="CCCCCC" w:sz="4" w:space="4"/>
+        </w:pBdr>
+        <w:shd w:fill="F5F5F5" w:val="clear"/>
+        <w:spacing w:after="0" w:before="0"/>
+        <w:ind w:left="180"/>
+      </w:pPr>
+      <w:r>
+        <w:rPr>
+          <w:rFonts w:ascii="Courier New" w:cs="Courier New" w:eastAsia="Courier New" w:hAnsi="Courier New"/>
+          <w:color w:val="1F1F1F"/>
+          <w:sz w:val="18"/>
+          <w:szCs w:val="18"/>
+        </w:rPr>
+        <w:t xml:space="preserve">    sw   x0, 0x1C(t0)       # RELOAD3 = 0</w:t>
+      </w:r>
+    </w:p>
+    <w:p>
+      <w:pPr>
+        <w:pBdr>
+          <w:top w:val="single" w:color="CCCCCC" w:sz="4" w:space="1"/>
+          <w:left w:val="single" w:color="CCCCCC" w:sz="4" w:space="4"/>
+          <w:bottom w:val="single" w:color="CCCCCC" w:sz="4" w:space="1"/>
+          <w:right w:val="single" w:color="CCCCCC" w:sz="4" w:space="4"/>
+        </w:pBdr>
+        <w:shd w:fill="F5F5F5" w:val="clear"/>
+        <w:spacing w:after="0" w:before="0"/>
+        <w:ind w:left="180"/>
+      </w:pPr>
+      <w:r>
+        <w:rPr>
+          <w:rFonts w:ascii="Courier New" w:cs="Courier New" w:eastAsia="Courier New" w:hAnsi="Courier New"/>
+          <w:color w:val="1F1F1F"/>
+          <w:sz w:val="18"/>
+          <w:szCs w:val="18"/>
+        </w:rPr>
+        <w:t xml:space="preserve"/>
+      </w:r>
+    </w:p>
+    <w:p>
+      <w:pPr>
+        <w:pBdr>
+          <w:top w:val="single" w:color="CCCCCC" w:sz="4" w:space="1"/>
+          <w:left w:val="single" w:color="CCCCCC" w:sz="4" w:space="4"/>
+          <w:bottom w:val="single" w:color="CCCCCC" w:sz="4" w:space="1"/>
+          <w:right w:val="single" w:color="CCCCCC" w:sz="4" w:space="4"/>
+        </w:pBdr>
+        <w:shd w:fill="F5F5F5" w:val="clear"/>
+        <w:spacing w:after="0" w:before="0"/>
+        <w:ind w:left="180"/>
+      </w:pPr>
+      <w:r>
+        <w:rPr>
+          <w:rFonts w:ascii="Courier New" w:cs="Courier New" w:eastAsia="Courier New" w:hAnsi="Courier New"/>
+          <w:color w:val="1F1F1F"/>
+          <w:sz w:val="18"/>
+          <w:szCs w:val="18"/>
+        </w:rPr>
+        <w:t xml:space="preserve">    # Start the timer</w:t>
+      </w:r>
+    </w:p>
+    <w:p>
+      <w:pPr>
+        <w:pBdr>
+          <w:top w:val="single" w:color="CCCCCC" w:sz="4" w:space="1"/>
+          <w:left w:val="single" w:color="CCCCCC" w:sz="4" w:space="4"/>
+          <w:bottom w:val="single" w:color="CCCCCC" w:sz="4" w:space="1"/>
+          <w:right w:val="single" w:color="CCCCCC" w:sz="4" w:space="4"/>
+        </w:pBdr>
+        <w:shd w:fill="F5F5F5" w:val="clear"/>
+        <w:spacing w:after="0" w:before="0"/>
+        <w:ind w:left="180"/>
+      </w:pPr>
+      <w:r>
+        <w:rPr>
+          <w:rFonts w:ascii="Courier New" w:cs="Courier New" w:eastAsia="Courier New" w:hAnsi="Courier New"/>
+          <w:color w:val="1F1F1F"/>
+          <w:sz w:val="18"/>
+          <w:szCs w:val="18"/>
+        </w:rPr>
+        <w:t xml:space="preserve">    li   t1, 1</w:t>
+      </w:r>
+    </w:p>
+    <w:p>
+      <w:pPr>
+        <w:pBdr>
+          <w:top w:val="single" w:color="CCCCCC" w:sz="4" w:space="1"/>
+          <w:left w:val="single" w:color="CCCCCC" w:sz="4" w:space="4"/>
+          <w:bottom w:val="single" w:color="CCCCCC" w:sz="4" w:space="1"/>
+          <w:right w:val="single" w:color="CCCCCC" w:sz="4" w:space="4"/>
+        </w:pBdr>
+        <w:shd w:fill="F5F5F5" w:val="clear"/>
+        <w:spacing w:after="0" w:before="0"/>
+        <w:ind w:left="180"/>
+      </w:pPr>
+      <w:r>
+        <w:rPr>
+          <w:rFonts w:ascii="Courier New" w:cs="Courier New" w:eastAsia="Courier New" w:hAnsi="Courier New"/>
+          <w:color w:val="1F1F1F"/>
+          <w:sz w:val="18"/>
+          <w:szCs w:val="18"/>
+        </w:rPr>
+        <w:t xml:space="preserve">    sw   t1, 0x20(t0)       # EN</w:t>
+      </w:r>
+    </w:p>
+    <w:p>
+      <w:pPr>
+        <w:spacing w:after="0" w:before="80"/>
+      </w:pPr>
+    </w:p>
+    <w:p>
+      <w:pPr>
+        <w:pStyle w:val="Heading2"/>
+        <w:spacing w:after="60" w:before="180"/>
+      </w:pPr>
+      <w:r>
+        <w:t xml:space="preserve">6.2  ISR Pattern — Servicing and Clearing the Timer Interrupt</w:t>
+      </w:r>
+    </w:p>
+    <w:p>
+      <w:pPr>
+        <w:spacing w:after="80" w:before="0"/>
+      </w:pPr>
+    </w:p>
+    <w:p>
+      <w:pPr>
+        <w:spacing w:after="80" w:before="80"/>
+      </w:pPr>
+      <w:r>
+        <w:rPr>
+          <w:sz w:val="20"/>
+          <w:szCs w:val="20"/>
+        </w:rPr>
+        <w:t xml:space="preserve">Inside your trap handler check mcause for 0x8000000B (bit 31 set = interrupt, lower 11 = CPU line 11). After servicing, write 1 to EV_PENDING (offset 0x3C) to clear the flag. The write must happen before mret or the CPU immediately re-enters the ISR.</w:t>
+      </w:r>
+    </w:p>
+    <w:p>
+      <w:pPr>
+        <w:spacing w:after="80" w:before="0"/>
+      </w:pPr>
+    </w:p>
+    <w:p>
+      <w:pPr>
+        <w:pBdr>
+          <w:top w:val="single" w:color="CCCCCC" w:sz="4" w:space="1"/>
+          <w:left w:val="single" w:color="CCCCCC" w:sz="4" w:space="4"/>
+          <w:bottom w:val="single" w:color="CCCCCC" w:sz="4" w:space="1"/>
+          <w:right w:val="single" w:color="CCCCCC" w:sz="4" w:space="4"/>
+        </w:pBdr>
+        <w:shd w:fill="F5F5F5" w:val="clear"/>
+        <w:spacing w:after="0" w:before="0"/>
+        <w:ind w:left="180"/>
+      </w:pPr>
+      <w:r>
+        <w:rPr>
+          <w:rFonts w:ascii="Courier New" w:cs="Courier New" w:eastAsia="Courier New" w:hAnsi="Courier New"/>
+          <w:color w:val="1F1F1F"/>
+          <w:sz w:val="18"/>
+          <w:szCs w:val="18"/>
+        </w:rPr>
+        <w:t xml:space="preserve">machine_trap_handler:</w:t>
+      </w:r>
+    </w:p>
+    <w:p>
+      <w:pPr>
+        <w:pBdr>
+          <w:top w:val="single" w:color="CCCCCC" w:sz="4" w:space="1"/>
+          <w:left w:val="single" w:color="CCCCCC" w:sz="4" w:space="4"/>
+          <w:bottom w:val="single" w:color="CCCCCC" w:sz="4" w:space="1"/>
+          <w:right w:val="single" w:color="CCCCCC" w:sz="4" w:space="4"/>
+        </w:pBdr>
+        <w:shd w:fill="F5F5F5" w:val="clear"/>
+        <w:spacing w:after="0" w:before="0"/>
+        <w:ind w:left="180"/>
+      </w:pPr>
+      <w:r>
+        <w:rPr>
+          <w:rFonts w:ascii="Courier New" w:cs="Courier New" w:eastAsia="Courier New" w:hAnsi="Courier New"/>
+          <w:color w:val="1F1F1F"/>
+          <w:sz w:val="18"/>
+          <w:szCs w:val="18"/>
+        </w:rPr>
+        <w:t xml:space="preserve">    addi  sp, sp, -64</w:t>
+      </w:r>
+    </w:p>
+    <w:p>
+      <w:pPr>
+        <w:pBdr>
+          <w:top w:val="single" w:color="CCCCCC" w:sz="4" w:space="1"/>
+          <w:left w:val="single" w:color="CCCCCC" w:sz="4" w:space="4"/>
+          <w:bottom w:val="single" w:color="CCCCCC" w:sz="4" w:space="1"/>
+          <w:right w:val="single" w:color="CCCCCC" w:sz="4" w:space="4"/>
+        </w:pBdr>
+        <w:shd w:fill="F5F5F5" w:val="clear"/>
+        <w:spacing w:after="0" w:before="0"/>
+        <w:ind w:left="180"/>
+      </w:pPr>
+      <w:r>
+        <w:rPr>
+          <w:rFonts w:ascii="Courier New" w:cs="Courier New" w:eastAsia="Courier New" w:hAnsi="Courier New"/>
+          <w:color w:val="1F1F1F"/>
+          <w:sz w:val="18"/>
+          <w:szCs w:val="18"/>
+        </w:rPr>
+        <w:t xml:space="preserve">    sw    ra,  0(sp)</w:t>
+      </w:r>
+    </w:p>
+    <w:p>
+      <w:pPr>
+        <w:pBdr>
+          <w:top w:val="single" w:color="CCCCCC" w:sz="4" w:space="1"/>
+          <w:left w:val="single" w:color="CCCCCC" w:sz="4" w:space="4"/>
+          <w:bottom w:val="single" w:color="CCCCCC" w:sz="4" w:space="1"/>
+          <w:right w:val="single" w:color="CCCCCC" w:sz="4" w:space="4"/>
+        </w:pBdr>
+        <w:shd w:fill="F5F5F5" w:val="clear"/>
+        <w:spacing w:after="0" w:before="0"/>
+        <w:ind w:left="180"/>
+      </w:pPr>
+      <w:r>
+        <w:rPr>
+          <w:rFonts w:ascii="Courier New" w:cs="Courier New" w:eastAsia="Courier New" w:hAnsi="Courier New"/>
+          <w:color w:val="1F1F1F"/>
+          <w:sz w:val="18"/>
+          <w:szCs w:val="18"/>
+        </w:rPr>
+        <w:t xml:space="preserve">    sw    t0,  4(sp)        # ... save t1-t6, a0-a7 similarly ...</w:t>
+      </w:r>
+    </w:p>
+    <w:p>
+      <w:pPr>
+        <w:pBdr>
+          <w:top w:val="single" w:color="CCCCCC" w:sz="4" w:space="1"/>
+          <w:left w:val="single" w:color="CCCCCC" w:sz="4" w:space="4"/>
+          <w:bottom w:val="single" w:color="CCCCCC" w:sz="4" w:space="1"/>
+          <w:right w:val="single" w:color="CCCCCC" w:sz="4" w:space="4"/>
+        </w:pBdr>
+        <w:shd w:fill="F5F5F5" w:val="clear"/>
+        <w:spacing w:after="0" w:before="0"/>
+        <w:ind w:left="180"/>
+      </w:pPr>
+      <w:r>
+        <w:rPr>
+          <w:rFonts w:ascii="Courier New" w:cs="Courier New" w:eastAsia="Courier New" w:hAnsi="Courier New"/>
+          <w:color w:val="1F1F1F"/>
+          <w:sz w:val="18"/>
+          <w:szCs w:val="18"/>
+        </w:rPr>
+        <w:t xml:space="preserve"/>
+      </w:r>
+    </w:p>
+    <w:p>
+      <w:pPr>
+        <w:pBdr>
+          <w:top w:val="single" w:color="CCCCCC" w:sz="4" w:space="1"/>
+          <w:left w:val="single" w:color="CCCCCC" w:sz="4" w:space="4"/>
+          <w:bottom w:val="single" w:color="CCCCCC" w:sz="4" w:space="1"/>
+          <w:right w:val="single" w:color="CCCCCC" w:sz="4" w:space="4"/>
+        </w:pBdr>
+        <w:shd w:fill="F5F5F5" w:val="clear"/>
+        <w:spacing w:after="0" w:before="0"/>
+        <w:ind w:left="180"/>
+      </w:pPr>
+      <w:r>
+        <w:rPr>
+          <w:rFonts w:ascii="Courier New" w:cs="Courier New" w:eastAsia="Courier New" w:hAnsi="Courier New"/>
+          <w:color w:val="1F1F1F"/>
+          <w:sz w:val="18"/>
+          <w:szCs w:val="18"/>
+        </w:rPr>
+        <w:t xml:space="preserve">    csrr  t0, mcause</w:t>
+      </w:r>
+    </w:p>
+    <w:p>
+      <w:pPr>
+        <w:pBdr>
+          <w:top w:val="single" w:color="CCCCCC" w:sz="4" w:space="1"/>
+          <w:left w:val="single" w:color="CCCCCC" w:sz="4" w:space="4"/>
+          <w:bottom w:val="single" w:color="CCCCCC" w:sz="4" w:space="1"/>
+          <w:right w:val="single" w:color="CCCCCC" w:sz="4" w:space="4"/>
+        </w:pBdr>
+        <w:shd w:fill="F5F5F5" w:val="clear"/>
+        <w:spacing w:after="0" w:before="0"/>
+        <w:ind w:left="180"/>
+      </w:pPr>
+      <w:r>
+        <w:rPr>
+          <w:rFonts w:ascii="Courier New" w:cs="Courier New" w:eastAsia="Courier New" w:hAnsi="Courier New"/>
+          <w:color w:val="1F1F1F"/>
+          <w:sz w:val="18"/>
+          <w:szCs w:val="18"/>
+        </w:rPr>
+        <w:t xml:space="preserve">    li    t1, 0x8000000B   # bit31=interrupt, source=11 (LiteX Timer)</w:t>
+      </w:r>
+    </w:p>
+    <w:p>
+      <w:pPr>
+        <w:pBdr>
+          <w:top w:val="single" w:color="CCCCCC" w:sz="4" w:space="1"/>
+          <w:left w:val="single" w:color="CCCCCC" w:sz="4" w:space="4"/>
+          <w:bottom w:val="single" w:color="CCCCCC" w:sz="4" w:space="1"/>
+          <w:right w:val="single" w:color="CCCCCC" w:sz="4" w:space="4"/>
+        </w:pBdr>
+        <w:shd w:fill="F5F5F5" w:val="clear"/>
+        <w:spacing w:after="0" w:before="0"/>
+        <w:ind w:left="180"/>
+      </w:pPr>
+      <w:r>
+        <w:rPr>
+          <w:rFonts w:ascii="Courier New" w:cs="Courier New" w:eastAsia="Courier New" w:hAnsi="Courier New"/>
+          <w:color w:val="1F1F1F"/>
+          <w:sz w:val="18"/>
+          <w:szCs w:val="18"/>
+        </w:rPr>
+        <w:t xml:space="preserve">    bne   t0, t1, .Ldone</w:t>
+      </w:r>
+    </w:p>
+    <w:p>
+      <w:pPr>
+        <w:pBdr>
+          <w:top w:val="single" w:color="CCCCCC" w:sz="4" w:space="1"/>
+          <w:left w:val="single" w:color="CCCCCC" w:sz="4" w:space="4"/>
+          <w:bottom w:val="single" w:color="CCCCCC" w:sz="4" w:space="1"/>
+          <w:right w:val="single" w:color="CCCCCC" w:sz="4" w:space="4"/>
+        </w:pBdr>
+        <w:shd w:fill="F5F5F5" w:val="clear"/>
+        <w:spacing w:after="0" w:before="0"/>
+        <w:ind w:left="180"/>
+      </w:pPr>
+      <w:r>
+        <w:rPr>
+          <w:rFonts w:ascii="Courier New" w:cs="Courier New" w:eastAsia="Courier New" w:hAnsi="Courier New"/>
+          <w:color w:val="1F1F1F"/>
+          <w:sz w:val="18"/>
+          <w:szCs w:val="18"/>
+        </w:rPr>
+        <w:t xml:space="preserve"/>
+      </w:r>
+    </w:p>
+    <w:p>
+      <w:pPr>
+        <w:pBdr>
+          <w:top w:val="single" w:color="CCCCCC" w:sz="4" w:space="1"/>
+          <w:left w:val="single" w:color="CCCCCC" w:sz="4" w:space="4"/>
+          <w:bottom w:val="single" w:color="CCCCCC" w:sz="4" w:space="1"/>
+          <w:right w:val="single" w:color="CCCCCC" w:sz="4" w:space="4"/>
+        </w:pBdr>
+        <w:shd w:fill="F5F5F5" w:val="clear"/>
+        <w:spacing w:after="0" w:before="0"/>
+        <w:ind w:left="180"/>
+      </w:pPr>
+      <w:r>
+        <w:rPr>
+          <w:rFonts w:ascii="Courier New" w:cs="Courier New" w:eastAsia="Courier New" w:hAnsi="Courier New"/>
+          <w:color w:val="1F1F1F"/>
+          <w:sz w:val="18"/>
+          <w:szCs w:val="18"/>
+        </w:rPr>
+        <w:t xml:space="preserve">    # --- service the timer interrupt ---</w:t>
+      </w:r>
+    </w:p>
+    <w:p>
+      <w:pPr>
+        <w:pBdr>
+          <w:top w:val="single" w:color="CCCCCC" w:sz="4" w:space="1"/>
+          <w:left w:val="single" w:color="CCCCCC" w:sz="4" w:space="4"/>
+          <w:bottom w:val="single" w:color="CCCCCC" w:sz="4" w:space="1"/>
+          <w:right w:val="single" w:color="CCCCCC" w:sz="4" w:space="4"/>
+        </w:pBdr>
+        <w:shd w:fill="F5F5F5" w:val="clear"/>
+        <w:spacing w:after="0" w:before="0"/>
+        <w:ind w:left="180"/>
+      </w:pPr>
+      <w:r>
+        <w:rPr>
+          <w:rFonts w:ascii="Courier New" w:cs="Courier New" w:eastAsia="Courier New" w:hAnsi="Courier New"/>
+          <w:color w:val="1F1F1F"/>
+          <w:sz w:val="18"/>
+          <w:szCs w:val="18"/>
+        </w:rPr>
+        <w:t xml:space="preserve">    # ... your code here ...</w:t>
+      </w:r>
+    </w:p>
+    <w:p>
+      <w:pPr>
+        <w:pBdr>
+          <w:top w:val="single" w:color="CCCCCC" w:sz="4" w:space="1"/>
+          <w:left w:val="single" w:color="CCCCCC" w:sz="4" w:space="4"/>
+          <w:bottom w:val="single" w:color="CCCCCC" w:sz="4" w:space="1"/>
+          <w:right w:val="single" w:color="CCCCCC" w:sz="4" w:space="4"/>
+        </w:pBdr>
+        <w:shd w:fill="F5F5F5" w:val="clear"/>
+        <w:spacing w:after="0" w:before="0"/>
+        <w:ind w:left="180"/>
+      </w:pPr>
+      <w:r>
+        <w:rPr>
+          <w:rFonts w:ascii="Courier New" w:cs="Courier New" w:eastAsia="Courier New" w:hAnsi="Courier New"/>
+          <w:color w:val="1F1F1F"/>
+          <w:sz w:val="18"/>
+          <w:szCs w:val="18"/>
+        </w:rPr>
+        <w:t xml:space="preserve"/>
+      </w:r>
+    </w:p>
+    <w:p>
+      <w:pPr>
+        <w:pBdr>
+          <w:top w:val="single" w:color="CCCCCC" w:sz="4" w:space="1"/>
+          <w:left w:val="single" w:color="CCCCCC" w:sz="4" w:space="4"/>
+          <w:bottom w:val="single" w:color="CCCCCC" w:sz="4" w:space="1"/>
+          <w:right w:val="single" w:color="CCCCCC" w:sz="4" w:space="4"/>
+        </w:pBdr>
+        <w:shd w:fill="F5F5F5" w:val="clear"/>
+        <w:spacing w:after="0" w:before="0"/>
+        <w:ind w:left="180"/>
+      </w:pPr>
+      <w:r>
+        <w:rPr>
+          <w:rFonts w:ascii="Courier New" w:cs="Courier New" w:eastAsia="Courier New" w:hAnsi="Courier New"/>
+          <w:color w:val="1F1F1F"/>
+          <w:sz w:val="18"/>
+          <w:szCs w:val="18"/>
+        </w:rPr>
+        <w:t xml:space="preserve">    # Clear EV_PENDING  ← REQUIRED before mret</w:t>
+      </w:r>
+    </w:p>
+    <w:p>
+      <w:pPr>
+        <w:pBdr>
+          <w:top w:val="single" w:color="CCCCCC" w:sz="4" w:space="1"/>
+          <w:left w:val="single" w:color="CCCCCC" w:sz="4" w:space="4"/>
+          <w:bottom w:val="single" w:color="CCCCCC" w:sz="4" w:space="1"/>
+          <w:right w:val="single" w:color="CCCCCC" w:sz="4" w:space="4"/>
+        </w:pBdr>
+        <w:shd w:fill="F5F5F5" w:val="clear"/>
+        <w:spacing w:after="0" w:before="0"/>
+        <w:ind w:left="180"/>
+      </w:pPr>
+      <w:r>
+        <w:rPr>
+          <w:rFonts w:ascii="Courier New" w:cs="Courier New" w:eastAsia="Courier New" w:hAnsi="Courier New"/>
+          <w:color w:val="1F1F1F"/>
+          <w:sz w:val="18"/>
+          <w:szCs w:val="18"/>
+        </w:rPr>
+        <w:t xml:space="preserve">    li    t0, 0xe000203C   # TIMER_BASE + 0x3C</w:t>
+      </w:r>
+    </w:p>
+    <w:p>
+      <w:pPr>
+        <w:pBdr>
+          <w:top w:val="single" w:color="CCCCCC" w:sz="4" w:space="1"/>
+          <w:left w:val="single" w:color="CCCCCC" w:sz="4" w:space="4"/>
+          <w:bottom w:val="single" w:color="CCCCCC" w:sz="4" w:space="1"/>
+          <w:right w:val="single" w:color="CCCCCC" w:sz="4" w:space="4"/>
+        </w:pBdr>
+        <w:shd w:fill="F5F5F5" w:val="clear"/>
+        <w:spacing w:after="0" w:before="0"/>
+        <w:ind w:left="180"/>
+      </w:pPr>
+      <w:r>
+        <w:rPr>
+          <w:rFonts w:ascii="Courier New" w:cs="Courier New" w:eastAsia="Courier New" w:hAnsi="Courier New"/>
+          <w:color w:val="1F1F1F"/>
+          <w:sz w:val="18"/>
+          <w:szCs w:val="18"/>
+        </w:rPr>
+        <w:t xml:space="preserve">    li    t1, 1</w:t>
+      </w:r>
+    </w:p>
+    <w:p>
+      <w:pPr>
+        <w:pBdr>
+          <w:top w:val="single" w:color="CCCCCC" w:sz="4" w:space="1"/>
+          <w:left w:val="single" w:color="CCCCCC" w:sz="4" w:space="4"/>
+          <w:bottom w:val="single" w:color="CCCCCC" w:sz="4" w:space="1"/>
+          <w:right w:val="single" w:color="CCCCCC" w:sz="4" w:space="4"/>
+        </w:pBdr>
+        <w:shd w:fill="F5F5F5" w:val="clear"/>
+        <w:spacing w:after="0" w:before="0"/>
+        <w:ind w:left="180"/>
+      </w:pPr>
+      <w:r>
+        <w:rPr>
+          <w:rFonts w:ascii="Courier New" w:cs="Courier New" w:eastAsia="Courier New" w:hAnsi="Courier New"/>
+          <w:color w:val="1F1F1F"/>
+          <w:sz w:val="18"/>
+          <w:szCs w:val="18"/>
+        </w:rPr>
+        <w:t xml:space="preserve">    sw    t1, 0(t0)</w:t>
+      </w:r>
+    </w:p>
+    <w:p>
+      <w:pPr>
+        <w:pBdr>
+          <w:top w:val="single" w:color="CCCCCC" w:sz="4" w:space="1"/>
+          <w:left w:val="single" w:color="CCCCCC" w:sz="4" w:space="4"/>
+          <w:bottom w:val="single" w:color="CCCCCC" w:sz="4" w:space="1"/>
+          <w:right w:val="single" w:color="CCCCCC" w:sz="4" w:space="4"/>
+        </w:pBdr>
+        <w:shd w:fill="F5F5F5" w:val="clear"/>
+        <w:spacing w:after="0" w:before="0"/>
+        <w:ind w:left="180"/>
+      </w:pPr>
+      <w:r>
+        <w:rPr>
+          <w:rFonts w:ascii="Courier New" w:cs="Courier New" w:eastAsia="Courier New" w:hAnsi="Courier New"/>
+          <w:color w:val="1F1F1F"/>
+          <w:sz w:val="18"/>
+          <w:szCs w:val="18"/>
+        </w:rPr>
+        <w:t xml:space="preserve"/>
+      </w:r>
+    </w:p>
+    <w:p>
+      <w:pPr>
+        <w:pBdr>
+          <w:top w:val="single" w:color="CCCCCC" w:sz="4" w:space="1"/>
+          <w:left w:val="single" w:color="CCCCCC" w:sz="4" w:space="4"/>
+          <w:bottom w:val="single" w:color="CCCCCC" w:sz="4" w:space="1"/>
+          <w:right w:val="single" w:color="CCCCCC" w:sz="4" w:space="4"/>
+        </w:pBdr>
+        <w:shd w:fill="F5F5F5" w:val="clear"/>
+        <w:spacing w:after="0" w:before="0"/>
+        <w:ind w:left="180"/>
+      </w:pPr>
+      <w:r>
+        <w:rPr>
+          <w:rFonts w:ascii="Courier New" w:cs="Courier New" w:eastAsia="Courier New" w:hAnsi="Courier New"/>
+          <w:color w:val="1F1F1F"/>
+          <w:sz w:val="18"/>
+          <w:szCs w:val="18"/>
+        </w:rPr>
+        <w:t xml:space="preserve">.Ldone:</w:t>
+      </w:r>
+    </w:p>
+    <w:p>
+      <w:pPr>
+        <w:pBdr>
+          <w:top w:val="single" w:color="CCCCCC" w:sz="4" w:space="1"/>
+          <w:left w:val="single" w:color="CCCCCC" w:sz="4" w:space="4"/>
+          <w:bottom w:val="single" w:color="CCCCCC" w:sz="4" w:space="1"/>
+          <w:right w:val="single" w:color="CCCCCC" w:sz="4" w:space="4"/>
+        </w:pBdr>
+        <w:shd w:fill="F5F5F5" w:val="clear"/>
+        <w:spacing w:after="0" w:before="0"/>
+        <w:ind w:left="180"/>
+      </w:pPr>
+      <w:r>
+        <w:rPr>
+          <w:rFonts w:ascii="Courier New" w:cs="Courier New" w:eastAsia="Courier New" w:hAnsi="Courier New"/>
+          <w:color w:val="1F1F1F"/>
+          <w:sz w:val="18"/>
+          <w:szCs w:val="18"/>
+        </w:rPr>
+        <w:t xml:space="preserve">    lw    ra,  0(sp)</w:t>
+      </w:r>
+    </w:p>
+    <w:p>
+      <w:pPr>
+        <w:pBdr>
+          <w:top w:val="single" w:color="CCCCCC" w:sz="4" w:space="1"/>
+          <w:left w:val="single" w:color="CCCCCC" w:sz="4" w:space="4"/>
+          <w:bottom w:val="single" w:color="CCCCCC" w:sz="4" w:space="1"/>
+          <w:right w:val="single" w:color="CCCCCC" w:sz="4" w:space="4"/>
+        </w:pBdr>
+        <w:shd w:fill="F5F5F5" w:val="clear"/>
+        <w:spacing w:after="0" w:before="0"/>
+        <w:ind w:left="180"/>
+      </w:pPr>
+      <w:r>
+        <w:rPr>
+          <w:rFonts w:ascii="Courier New" w:cs="Courier New" w:eastAsia="Courier New" w:hAnsi="Courier New"/>
+          <w:color w:val="1F1F1F"/>
+          <w:sz w:val="18"/>
+          <w:szCs w:val="18"/>
+        </w:rPr>
+        <w:t xml:space="preserve">    lw    t0,  4(sp)</w:t>
+      </w:r>
+    </w:p>
+    <w:p>
+      <w:pPr>
+        <w:pBdr>
+          <w:top w:val="single" w:color="CCCCCC" w:sz="4" w:space="1"/>
+          <w:left w:val="single" w:color="CCCCCC" w:sz="4" w:space="4"/>
+          <w:bottom w:val="single" w:color="CCCCCC" w:sz="4" w:space="1"/>
+          <w:right w:val="single" w:color="CCCCCC" w:sz="4" w:space="4"/>
+        </w:pBdr>
+        <w:shd w:fill="F5F5F5" w:val="clear"/>
+        <w:spacing w:after="0" w:before="0"/>
+        <w:ind w:left="180"/>
+      </w:pPr>
+      <w:r>
+        <w:rPr>
+          <w:rFonts w:ascii="Courier New" w:cs="Courier New" w:eastAsia="Courier New" w:hAnsi="Courier New"/>
+          <w:color w:val="1F1F1F"/>
+          <w:sz w:val="18"/>
+          <w:szCs w:val="18"/>
+        </w:rPr>
+        <w:t xml:space="preserve">    addi  sp, sp, 64</w:t>
+      </w:r>
+    </w:p>
+    <w:p>
+      <w:pPr>
+        <w:pBdr>
+          <w:top w:val="single" w:color="CCCCCC" w:sz="4" w:space="1"/>
+          <w:left w:val="single" w:color="CCCCCC" w:sz="4" w:space="4"/>
+          <w:bottom w:val="single" w:color="CCCCCC" w:sz="4" w:space="1"/>
+          <w:right w:val="single" w:color="CCCCCC" w:sz="4" w:space="4"/>
+        </w:pBdr>
+        <w:shd w:fill="F5F5F5" w:val="clear"/>
+        <w:spacing w:after="0" w:before="0"/>
+        <w:ind w:left="180"/>
+      </w:pPr>
+      <w:r>
+        <w:rPr>
+          <w:rFonts w:ascii="Courier New" w:cs="Courier New" w:eastAsia="Courier New" w:hAnsi="Courier New"/>
+          <w:color w:val="1F1F1F"/>
+          <w:sz w:val="18"/>
+          <w:szCs w:val="18"/>
+        </w:rPr>
+        <w:t xml:space="preserve">    mret</w:t>
+      </w:r>
+    </w:p>
+    <w:p>
+      <w:pPr>
+        <w:spacing w:after="0" w:before="80"/>
+      </w:pPr>
+    </w:p>
+    <w:p>
+      <w:pPr>
+        <w:pBdr>
+          <w:left w:val="single" w:color="2E75B6" w:sz="12" w:space="6"/>
+        </w:pBdr>
+        <w:spacing w:after="80" w:before="80"/>
+        <w:ind w:left="360"/>
+      </w:pPr>
+      <w:r>
+        <w:rPr>
           <w:b/>
           <w:bCs/>
-          <w:color w:val="000000"/>
-          <w:sz w:val="26"/>
-          <w:szCs w:val="26"/>
-        </w:rPr>
-        <w:t xml:space="preserve">6.1  One-Shot Timer Example (500 ms at 100 MHz)</w:t>
-      </w:r>
-    </w:p>
-    <w:p>
-      <w:pPr>
-        <w:shd w:fill="F2F2F2" w:val="clear"/>
-        <w:spacing w:after="60" w:before="60"/>
-        <w:ind w:left="360"/>
-      </w:pPr>
-      <w:r>
-        <w:rPr>
-          <w:rFonts w:ascii="Courier New" w:cs="Courier New" w:eastAsia="Courier New" w:hAnsi="Courier New"/>
-          <w:sz w:val="17"/>
-          <w:szCs w:val="17"/>
-        </w:rPr>
-        <w:t xml:space="preserve">    li   t0, 0xe0002000</w:t>
-      </w:r>
-    </w:p>
-    <w:p>
-      <w:pPr>
-        <w:shd w:fill="F2F2F2" w:val="clear"/>
-        <w:spacing w:after="60" w:before="60"/>
-        <w:ind w:left="360"/>
-      </w:pPr>
-      <w:r>
-        <w:rPr>
-          <w:rFonts w:ascii="Courier New" w:cs="Courier New" w:eastAsia="Courier New" w:hAnsi="Courier New"/>
-          <w:sz w:val="17"/>
-          <w:szCs w:val="17"/>
-        </w:rPr>
-        <w:t xml:space="preserve">    li   t1, 50000000         # 100 MHz / 2 = 0.5 s</w:t>
-      </w:r>
-    </w:p>
-    <w:p>
-      <w:pPr>
-        <w:shd w:fill="F2F2F2" w:val="clear"/>
-        <w:spacing w:after="60" w:before="60"/>
-        <w:ind w:left="360"/>
-      </w:pPr>
-      <w:r>
-        <w:rPr>
-          <w:rFonts w:ascii="Courier New" w:cs="Courier New" w:eastAsia="Courier New" w:hAnsi="Courier New"/>
-          <w:sz w:val="17"/>
-          <w:szCs w:val="17"/>
-        </w:rPr>
-        <w:t xml:space="preserve">    sw   t1, 0(t0)            # LOAD</w:t>
-      </w:r>
-    </w:p>
-    <w:p>
-      <w:pPr>
-        <w:shd w:fill="F2F2F2" w:val="clear"/>
-        <w:spacing w:after="60" w:before="60"/>
-        <w:ind w:left="360"/>
-      </w:pPr>
-      <w:r>
-        <w:rPr>
-          <w:rFonts w:ascii="Courier New" w:cs="Courier New" w:eastAsia="Courier New" w:hAnsi="Courier New"/>
-          <w:sz w:val="17"/>
-          <w:szCs w:val="17"/>
-        </w:rPr>
-        <w:t xml:space="preserve">    sw   zero, 4(t0)          # RELOAD = 0 (one-shot)</w:t>
-      </w:r>
-    </w:p>
-    <w:p>
-      <w:pPr>
-        <w:shd w:fill="F2F2F2" w:val="clear"/>
-        <w:spacing w:after="60" w:before="60"/>
-        <w:ind w:left="360"/>
-      </w:pPr>
-      <w:r>
-        <w:rPr>
-          <w:rFonts w:ascii="Courier New" w:cs="Courier New" w:eastAsia="Courier New" w:hAnsi="Courier New"/>
-          <w:sz w:val="17"/>
-          <w:szCs w:val="17"/>
-        </w:rPr>
-        <w:t xml:space="preserve">    li   t1, 1</w:t>
-      </w:r>
-    </w:p>
-    <w:p>
-      <w:pPr>
-        <w:shd w:fill="F2F2F2" w:val="clear"/>
-        <w:spacing w:after="60" w:before="60"/>
-        <w:ind w:left="360"/>
-      </w:pPr>
-      <w:r>
-        <w:rPr>
-          <w:rFonts w:ascii="Courier New" w:cs="Courier New" w:eastAsia="Courier New" w:hAnsi="Courier New"/>
-          <w:sz w:val="17"/>
-          <w:szCs w:val="17"/>
-        </w:rPr>
-        <w:t xml:space="preserve">    sw   t1, 0x1C(t0)         # EV_ENABLE</w:t>
-      </w:r>
-    </w:p>
-    <w:p>
-      <w:pPr>
-        <w:shd w:fill="F2F2F2" w:val="clear"/>
-        <w:spacing w:after="60" w:before="60"/>
-        <w:ind w:left="360"/>
-      </w:pPr>
-      <w:r>
-        <w:rPr>
-          <w:rFonts w:ascii="Courier New" w:cs="Courier New" w:eastAsia="Courier New" w:hAnsi="Courier New"/>
-          <w:sz w:val="17"/>
-          <w:szCs w:val="17"/>
-        </w:rPr>
-        <w:t xml:space="preserve">    sw   t1, 0x08(t0)         # EN — start timer</w:t>
-      </w:r>
-    </w:p>
-    <w:p>
-      <w:pPr>
-        <w:spacing w:after="0" w:before="80"/>
-      </w:pPr>
-    </w:p>
-    <w:p>
-      <w:pPr>
-        <w:spacing w:after="80" w:before="80"/>
-        <w:ind w:left="360"/>
-      </w:pPr>
-      <w:r>
-        <w:rPr>
-          <w:b/>
-          <w:bCs/>
-          <w:color w:val="2E75B6"/>
+          <w:color w:val="1F4E79"/>
           <w:sz w:val="18"/>
           <w:szCs w:val="18"/>
         </w:rPr>
@@ -8292,897 +9643,17 @@
       </w:r>
       <w:r>
         <w:rPr>
-          <w:i/>
-          <w:iCs/>
+          <w:color w:val="1F4E79"/>
           <w:sz w:val="18"/>
           <w:szCs w:val="18"/>
         </w:rPr>
-        <w:t xml:space="preserve">To use the timer with interrupts, also set mie bit 11 (MEIE) and set mstatus.MIE as shown in Section 4.1. In your ISR, write 1 to EV_PENDING (offset 0x18) to clear the pending flag before returning.</w:t>
-      </w:r>
-    </w:p>
-    <w:p>
-      <w:pPr>
-        <w:spacing w:after="0" w:before="240"/>
-      </w:pPr>
-    </w:p>
-    <w:p>
-      <w:pPr>
-        <w:pStyle w:val="Heading1"/>
-        <w:spacing w:after="120" w:before="360"/>
-      </w:pPr>
-      <w:r>
-        <w:rPr>
-          <w:rFonts w:ascii="Arial" w:cs="Arial" w:eastAsia="Arial" w:hAnsi="Arial"/>
-          <w:b/>
-          <w:bCs/>
-          <w:color w:val="2E75B6"/>
-          <w:sz w:val="32"/>
-          <w:szCs w:val="32"/>
-        </w:rPr>
-        <w:t xml:space="preserve">7.  CLINT — Core-Level Interruptor</w:t>
-      </w:r>
-    </w:p>
-    <w:p>
-      <w:pPr>
-        <w:pBdr>
-          <w:bottom w:val="single" w:color="2E75B6" w:sz="6" w:space="1"/>
-        </w:pBdr>
-        <w:spacing w:after="0"/>
-      </w:pPr>
-    </w:p>
-    <w:p>
-      <w:pPr>
-        <w:spacing w:after="0" w:before="120"/>
-      </w:pPr>
-    </w:p>
-    <w:p>
-      <w:pPr>
-        <w:spacing w:after="80" w:before="80"/>
-      </w:pPr>
-      <w:r>
-        <w:rPr>
-          <w:sz w:val="20"/>
-          <w:szCs w:val="20"/>
-        </w:rPr>
-        <w:t xml:space="preserve">The CLINT provides machine-level timer and software interrupts directly to the CPU, per the RISC-V privilege specification. It does NOT pass through an external interrupt controller.</w:t>
-      </w:r>
-    </w:p>
-    <w:p>
-      <w:pPr>
-        <w:spacing w:after="0" w:before="120"/>
-      </w:pPr>
-    </w:p>
-    <w:p>
-      <w:pPr>
-        <w:spacing w:after="80" w:before="80"/>
-      </w:pPr>
-      <w:r>
-        <w:rPr>
-          <w:b/>
-          <w:bCs/>
-          <w:sz w:val="20"/>
-          <w:szCs w:val="20"/>
-        </w:rPr>
-        <w:t xml:space="preserve">Base Address: 0xe0005000    |    Frequency: 100,000,000 Hz</w:t>
-      </w:r>
-    </w:p>
-    <w:p>
-      <w:pPr>
-        <w:spacing w:after="0" w:before="120"/>
-      </w:pPr>
-    </w:p>
-    <w:tbl>
-      <w:tblPr>
-        <w:tblW w:type="dxa" w:w="9080"/>
-        <w:tblBorders>
-          <w:top w:val="single" w:color="auto" w:sz="4"/>
-          <w:left w:val="single" w:color="auto" w:sz="4"/>
-          <w:bottom w:val="single" w:color="auto" w:sz="4"/>
-          <w:right w:val="single" w:color="auto" w:sz="4"/>
-          <w:insideH w:val="single" w:color="auto" w:sz="4"/>
-          <w:insideV w:val="single" w:color="auto" w:sz="4"/>
-        </w:tblBorders>
-      </w:tblPr>
-      <w:tblGrid>
-        <w:gridCol w:w="1200"/>
-        <w:gridCol w:w="1680"/>
-        <w:gridCol w:w="960"/>
-        <w:gridCol w:w="960"/>
-        <w:gridCol w:w="4280"/>
-      </w:tblGrid>
-      <w:tr>
-        <w:trPr>
-          <w:tblHeader/>
-        </w:trPr>
-        <w:tc>
-          <w:tcPr>
-            <w:tcW w:type="dxa" w:w="1200"/>
-            <w:tcBorders>
-              <w:top w:val="single" w:color="1F4E79" w:sz="1"/>
-              <w:left w:val="single" w:color="1F4E79" w:sz="1"/>
-              <w:bottom w:val="single" w:color="1F4E79" w:sz="1"/>
-              <w:right w:val="single" w:color="1F4E79" w:sz="1"/>
-            </w:tcBorders>
-            <w:shd w:fill="1F4E79" w:val="clear"/>
-            <w:tcMar>
-              <w:top w:type="dxa" w:w="80"/>
-              <w:left w:type="dxa" w:w="120"/>
-              <w:bottom w:type="dxa" w:w="80"/>
-              <w:right w:type="dxa" w:w="120"/>
-            </w:tcMar>
-            <w:vAlign w:val="center"/>
-          </w:tcPr>
-          <w:p>
-            <w:pPr>
-              <w:jc w:val="left"/>
-            </w:pPr>
-            <w:r>
-              <w:rPr>
-                <w:rFonts w:ascii="Arial" w:cs="Arial" w:eastAsia="Arial" w:hAnsi="Arial"/>
-                <w:b/>
-                <w:bCs/>
-                <w:color w:val="FFFFFF"/>
-                <w:sz w:val="18"/>
-                <w:szCs w:val="18"/>
-              </w:rPr>
-              <w:t xml:space="preserve">Offset</w:t>
-            </w:r>
-          </w:p>
-        </w:tc>
-        <w:tc>
-          <w:tcPr>
-            <w:tcW w:type="dxa" w:w="1680"/>
-            <w:tcBorders>
-              <w:top w:val="single" w:color="1F4E79" w:sz="1"/>
-              <w:left w:val="single" w:color="1F4E79" w:sz="1"/>
-              <w:bottom w:val="single" w:color="1F4E79" w:sz="1"/>
-              <w:right w:val="single" w:color="1F4E79" w:sz="1"/>
-            </w:tcBorders>
-            <w:shd w:fill="1F4E79" w:val="clear"/>
-            <w:tcMar>
-              <w:top w:type="dxa" w:w="80"/>
-              <w:left w:type="dxa" w:w="120"/>
-              <w:bottom w:type="dxa" w:w="80"/>
-              <w:right w:type="dxa" w:w="120"/>
-            </w:tcMar>
-            <w:vAlign w:val="center"/>
-          </w:tcPr>
-          <w:p>
-            <w:pPr>
-              <w:jc w:val="left"/>
-            </w:pPr>
-            <w:r>
-              <w:rPr>
-                <w:rFonts w:ascii="Arial" w:cs="Arial" w:eastAsia="Arial" w:hAnsi="Arial"/>
-                <w:b/>
-                <w:bCs/>
-                <w:color w:val="FFFFFF"/>
-                <w:sz w:val="18"/>
-                <w:szCs w:val="18"/>
-              </w:rPr>
-              <w:t xml:space="preserve">Register</w:t>
-            </w:r>
-          </w:p>
-        </w:tc>
-        <w:tc>
-          <w:tcPr>
-            <w:tcW w:type="dxa" w:w="960"/>
-            <w:tcBorders>
-              <w:top w:val="single" w:color="1F4E79" w:sz="1"/>
-              <w:left w:val="single" w:color="1F4E79" w:sz="1"/>
-              <w:bottom w:val="single" w:color="1F4E79" w:sz="1"/>
-              <w:right w:val="single" w:color="1F4E79" w:sz="1"/>
-            </w:tcBorders>
-            <w:shd w:fill="1F4E79" w:val="clear"/>
-            <w:tcMar>
-              <w:top w:type="dxa" w:w="80"/>
-              <w:left w:type="dxa" w:w="120"/>
-              <w:bottom w:type="dxa" w:w="80"/>
-              <w:right w:type="dxa" w:w="120"/>
-            </w:tcMar>
-            <w:vAlign w:val="center"/>
-          </w:tcPr>
-          <w:p>
-            <w:pPr>
-              <w:jc w:val="left"/>
-            </w:pPr>
-            <w:r>
-              <w:rPr>
-                <w:rFonts w:ascii="Arial" w:cs="Arial" w:eastAsia="Arial" w:hAnsi="Arial"/>
-                <w:b/>
-                <w:bCs/>
-                <w:color w:val="FFFFFF"/>
-                <w:sz w:val="18"/>
-                <w:szCs w:val="18"/>
-              </w:rPr>
-              <w:t xml:space="preserve">Width</w:t>
-            </w:r>
-          </w:p>
-        </w:tc>
-        <w:tc>
-          <w:tcPr>
-            <w:tcW w:type="dxa" w:w="960"/>
-            <w:tcBorders>
-              <w:top w:val="single" w:color="1F4E79" w:sz="1"/>
-              <w:left w:val="single" w:color="1F4E79" w:sz="1"/>
-              <w:bottom w:val="single" w:color="1F4E79" w:sz="1"/>
-              <w:right w:val="single" w:color="1F4E79" w:sz="1"/>
-            </w:tcBorders>
-            <w:shd w:fill="1F4E79" w:val="clear"/>
-            <w:tcMar>
-              <w:top w:type="dxa" w:w="80"/>
-              <w:left w:type="dxa" w:w="120"/>
-              <w:bottom w:type="dxa" w:w="80"/>
-              <w:right w:type="dxa" w:w="120"/>
-            </w:tcMar>
-            <w:vAlign w:val="center"/>
-          </w:tcPr>
-          <w:p>
-            <w:pPr>
-              <w:jc w:val="left"/>
-            </w:pPr>
-            <w:r>
-              <w:rPr>
-                <w:rFonts w:ascii="Arial" w:cs="Arial" w:eastAsia="Arial" w:hAnsi="Arial"/>
-                <w:b/>
-                <w:bCs/>
-                <w:color w:val="FFFFFF"/>
-                <w:sz w:val="18"/>
-                <w:szCs w:val="18"/>
-              </w:rPr>
-              <w:t xml:space="preserve">Access</w:t>
-            </w:r>
-          </w:p>
-        </w:tc>
-        <w:tc>
-          <w:tcPr>
-            <w:tcW w:type="dxa" w:w="4280"/>
-            <w:tcBorders>
-              <w:top w:val="single" w:color="1F4E79" w:sz="1"/>
-              <w:left w:val="single" w:color="1F4E79" w:sz="1"/>
-              <w:bottom w:val="single" w:color="1F4E79" w:sz="1"/>
-              <w:right w:val="single" w:color="1F4E79" w:sz="1"/>
-            </w:tcBorders>
-            <w:shd w:fill="1F4E79" w:val="clear"/>
-            <w:tcMar>
-              <w:top w:type="dxa" w:w="80"/>
-              <w:left w:type="dxa" w:w="120"/>
-              <w:bottom w:type="dxa" w:w="80"/>
-              <w:right w:type="dxa" w:w="120"/>
-            </w:tcMar>
-            <w:vAlign w:val="center"/>
-          </w:tcPr>
-          <w:p>
-            <w:pPr>
-              <w:jc w:val="left"/>
-            </w:pPr>
-            <w:r>
-              <w:rPr>
-                <w:rFonts w:ascii="Arial" w:cs="Arial" w:eastAsia="Arial" w:hAnsi="Arial"/>
-                <w:b/>
-                <w:bCs/>
-                <w:color w:val="FFFFFF"/>
-                <w:sz w:val="18"/>
-                <w:szCs w:val="18"/>
-              </w:rPr>
-              <w:t xml:space="preserve">Description</w:t>
-            </w:r>
-          </w:p>
-        </w:tc>
-      </w:tr>
-      <w:tr>
-        <w:tc>
-          <w:tcPr>
-            <w:tcW w:type="dxa" w:w="1200"/>
-            <w:tcBorders>
-              <w:top w:val="single" w:color="A0BDD4" w:sz="1"/>
-              <w:left w:val="single" w:color="A0BDD4" w:sz="1"/>
-              <w:bottom w:val="single" w:color="A0BDD4" w:sz="1"/>
-              <w:right w:val="single" w:color="A0BDD4" w:sz="1"/>
-            </w:tcBorders>
-            <w:shd w:fill="FFFFFF" w:val="clear"/>
-            <w:tcMar>
-              <w:top w:type="dxa" w:w="80"/>
-              <w:left w:type="dxa" w:w="120"/>
-              <w:bottom w:type="dxa" w:w="80"/>
-              <w:right w:type="dxa" w:w="120"/>
-            </w:tcMar>
-          </w:tcPr>
-          <w:p>
-            <w:r>
-              <w:rPr>
-                <w:rFonts w:ascii="Courier New" w:cs="Courier New" w:eastAsia="Courier New" w:hAnsi="Courier New"/>
-                <w:sz w:val="18"/>
-                <w:szCs w:val="18"/>
-              </w:rPr>
-              <w:t xml:space="preserve">0x0000</w:t>
-            </w:r>
-          </w:p>
-        </w:tc>
-        <w:tc>
-          <w:tcPr>
-            <w:tcW w:type="dxa" w:w="1680"/>
-            <w:tcBorders>
-              <w:top w:val="single" w:color="A0BDD4" w:sz="1"/>
-              <w:left w:val="single" w:color="A0BDD4" w:sz="1"/>
-              <w:bottom w:val="single" w:color="A0BDD4" w:sz="1"/>
-              <w:right w:val="single" w:color="A0BDD4" w:sz="1"/>
-            </w:tcBorders>
-            <w:shd w:fill="FFFFFF" w:val="clear"/>
-            <w:tcMar>
-              <w:top w:type="dxa" w:w="80"/>
-              <w:left w:type="dxa" w:w="120"/>
-              <w:bottom w:type="dxa" w:w="80"/>
-              <w:right w:type="dxa" w:w="120"/>
-            </w:tcMar>
-          </w:tcPr>
-          <w:p>
-            <w:r>
-              <w:rPr>
-                <w:rFonts w:ascii="Arial" w:cs="Arial" w:eastAsia="Arial" w:hAnsi="Arial"/>
-                <w:sz w:val="18"/>
-                <w:szCs w:val="18"/>
-              </w:rPr>
-              <w:t xml:space="preserve">MSIP</w:t>
-            </w:r>
-          </w:p>
-        </w:tc>
-        <w:tc>
-          <w:tcPr>
-            <w:tcW w:type="dxa" w:w="960"/>
-            <w:tcBorders>
-              <w:top w:val="single" w:color="A0BDD4" w:sz="1"/>
-              <w:left w:val="single" w:color="A0BDD4" w:sz="1"/>
-              <w:bottom w:val="single" w:color="A0BDD4" w:sz="1"/>
-              <w:right w:val="single" w:color="A0BDD4" w:sz="1"/>
-            </w:tcBorders>
-            <w:shd w:fill="FFFFFF" w:val="clear"/>
-            <w:tcMar>
-              <w:top w:type="dxa" w:w="80"/>
-              <w:left w:type="dxa" w:w="120"/>
-              <w:bottom w:type="dxa" w:w="80"/>
-              <w:right w:type="dxa" w:w="120"/>
-            </w:tcMar>
-          </w:tcPr>
-          <w:p>
-            <w:r>
-              <w:rPr>
-                <w:rFonts w:ascii="Arial" w:cs="Arial" w:eastAsia="Arial" w:hAnsi="Arial"/>
-                <w:sz w:val="18"/>
-                <w:szCs w:val="18"/>
-              </w:rPr>
-              <w:t xml:space="preserve">32-bit</w:t>
-            </w:r>
-          </w:p>
-        </w:tc>
-        <w:tc>
-          <w:tcPr>
-            <w:tcW w:type="dxa" w:w="960"/>
-            <w:tcBorders>
-              <w:top w:val="single" w:color="A0BDD4" w:sz="1"/>
-              <w:left w:val="single" w:color="A0BDD4" w:sz="1"/>
-              <w:bottom w:val="single" w:color="A0BDD4" w:sz="1"/>
-              <w:right w:val="single" w:color="A0BDD4" w:sz="1"/>
-            </w:tcBorders>
-            <w:shd w:fill="FFFFFF" w:val="clear"/>
-            <w:tcMar>
-              <w:top w:type="dxa" w:w="80"/>
-              <w:left w:type="dxa" w:w="120"/>
-              <w:bottom w:type="dxa" w:w="80"/>
-              <w:right w:type="dxa" w:w="120"/>
-            </w:tcMar>
-          </w:tcPr>
-          <w:p>
-            <w:r>
-              <w:rPr>
-                <w:rFonts w:ascii="Arial" w:cs="Arial" w:eastAsia="Arial" w:hAnsi="Arial"/>
-                <w:sz w:val="18"/>
-                <w:szCs w:val="18"/>
-              </w:rPr>
-              <w:t xml:space="preserve">R / W</w:t>
-            </w:r>
-          </w:p>
-        </w:tc>
-        <w:tc>
-          <w:tcPr>
-            <w:tcW w:type="dxa" w:w="4280"/>
-            <w:tcBorders>
-              <w:top w:val="single" w:color="A0BDD4" w:sz="1"/>
-              <w:left w:val="single" w:color="A0BDD4" w:sz="1"/>
-              <w:bottom w:val="single" w:color="A0BDD4" w:sz="1"/>
-              <w:right w:val="single" w:color="A0BDD4" w:sz="1"/>
-            </w:tcBorders>
-            <w:shd w:fill="FFFFFF" w:val="clear"/>
-            <w:tcMar>
-              <w:top w:type="dxa" w:w="80"/>
-              <w:left w:type="dxa" w:w="120"/>
-              <w:bottom w:type="dxa" w:w="80"/>
-              <w:right w:type="dxa" w:w="120"/>
-            </w:tcMar>
-          </w:tcPr>
-          <w:p>
-            <w:r>
-              <w:rPr>
-                <w:rFonts w:ascii="Arial" w:cs="Arial" w:eastAsia="Arial" w:hAnsi="Arial"/>
-                <w:sz w:val="18"/>
-                <w:szCs w:val="18"/>
-              </w:rPr>
-              <w:t xml:space="preserve">Machine software interrupt pending. Write 1 to assert, 0 to clear. Fires IRQ on CPU line 3.</w:t>
-            </w:r>
-          </w:p>
-        </w:tc>
-      </w:tr>
-      <w:tr>
-        <w:tc>
-          <w:tcPr>
-            <w:tcW w:type="dxa" w:w="1200"/>
-            <w:tcBorders>
-              <w:top w:val="single" w:color="A0BDD4" w:sz="1"/>
-              <w:left w:val="single" w:color="A0BDD4" w:sz="1"/>
-              <w:bottom w:val="single" w:color="A0BDD4" w:sz="1"/>
-              <w:right w:val="single" w:color="A0BDD4" w:sz="1"/>
-            </w:tcBorders>
-            <w:shd w:fill="EEF4FB" w:val="clear"/>
-            <w:tcMar>
-              <w:top w:type="dxa" w:w="80"/>
-              <w:left w:type="dxa" w:w="120"/>
-              <w:bottom w:type="dxa" w:w="80"/>
-              <w:right w:type="dxa" w:w="120"/>
-            </w:tcMar>
-          </w:tcPr>
-          <w:p>
-            <w:r>
-              <w:rPr>
-                <w:rFonts w:ascii="Courier New" w:cs="Courier New" w:eastAsia="Courier New" w:hAnsi="Courier New"/>
-                <w:sz w:val="18"/>
-                <w:szCs w:val="18"/>
-              </w:rPr>
-              <w:t xml:space="preserve">0x4000</w:t>
-            </w:r>
-          </w:p>
-        </w:tc>
-        <w:tc>
-          <w:tcPr>
-            <w:tcW w:type="dxa" w:w="1680"/>
-            <w:tcBorders>
-              <w:top w:val="single" w:color="A0BDD4" w:sz="1"/>
-              <w:left w:val="single" w:color="A0BDD4" w:sz="1"/>
-              <w:bottom w:val="single" w:color="A0BDD4" w:sz="1"/>
-              <w:right w:val="single" w:color="A0BDD4" w:sz="1"/>
-            </w:tcBorders>
-            <w:shd w:fill="EEF4FB" w:val="clear"/>
-            <w:tcMar>
-              <w:top w:type="dxa" w:w="80"/>
-              <w:left w:type="dxa" w:w="120"/>
-              <w:bottom w:type="dxa" w:w="80"/>
-              <w:right w:type="dxa" w:w="120"/>
-            </w:tcMar>
-          </w:tcPr>
-          <w:p>
-            <w:r>
-              <w:rPr>
-                <w:rFonts w:ascii="Arial" w:cs="Arial" w:eastAsia="Arial" w:hAnsi="Arial"/>
-                <w:sz w:val="18"/>
-                <w:szCs w:val="18"/>
-              </w:rPr>
-              <w:t xml:space="preserve">MTIMECMP</w:t>
-            </w:r>
-          </w:p>
-        </w:tc>
-        <w:tc>
-          <w:tcPr>
-            <w:tcW w:type="dxa" w:w="960"/>
-            <w:tcBorders>
-              <w:top w:val="single" w:color="A0BDD4" w:sz="1"/>
-              <w:left w:val="single" w:color="A0BDD4" w:sz="1"/>
-              <w:bottom w:val="single" w:color="A0BDD4" w:sz="1"/>
-              <w:right w:val="single" w:color="A0BDD4" w:sz="1"/>
-            </w:tcBorders>
-            <w:shd w:fill="EEF4FB" w:val="clear"/>
-            <w:tcMar>
-              <w:top w:type="dxa" w:w="80"/>
-              <w:left w:type="dxa" w:w="120"/>
-              <w:bottom w:type="dxa" w:w="80"/>
-              <w:right w:type="dxa" w:w="120"/>
-            </w:tcMar>
-          </w:tcPr>
-          <w:p>
-            <w:r>
-              <w:rPr>
-                <w:rFonts w:ascii="Arial" w:cs="Arial" w:eastAsia="Arial" w:hAnsi="Arial"/>
-                <w:sz w:val="18"/>
-                <w:szCs w:val="18"/>
-              </w:rPr>
-              <w:t xml:space="preserve">64-bit</w:t>
-            </w:r>
-          </w:p>
-        </w:tc>
-        <w:tc>
-          <w:tcPr>
-            <w:tcW w:type="dxa" w:w="960"/>
-            <w:tcBorders>
-              <w:top w:val="single" w:color="A0BDD4" w:sz="1"/>
-              <w:left w:val="single" w:color="A0BDD4" w:sz="1"/>
-              <w:bottom w:val="single" w:color="A0BDD4" w:sz="1"/>
-              <w:right w:val="single" w:color="A0BDD4" w:sz="1"/>
-            </w:tcBorders>
-            <w:shd w:fill="EEF4FB" w:val="clear"/>
-            <w:tcMar>
-              <w:top w:type="dxa" w:w="80"/>
-              <w:left w:type="dxa" w:w="120"/>
-              <w:bottom w:type="dxa" w:w="80"/>
-              <w:right w:type="dxa" w:w="120"/>
-            </w:tcMar>
-          </w:tcPr>
-          <w:p>
-            <w:r>
-              <w:rPr>
-                <w:rFonts w:ascii="Arial" w:cs="Arial" w:eastAsia="Arial" w:hAnsi="Arial"/>
-                <w:sz w:val="18"/>
-                <w:szCs w:val="18"/>
-              </w:rPr>
-              <w:t xml:space="preserve">R / W</w:t>
-            </w:r>
-          </w:p>
-        </w:tc>
-        <w:tc>
-          <w:tcPr>
-            <w:tcW w:type="dxa" w:w="4280"/>
-            <w:tcBorders>
-              <w:top w:val="single" w:color="A0BDD4" w:sz="1"/>
-              <w:left w:val="single" w:color="A0BDD4" w:sz="1"/>
-              <w:bottom w:val="single" w:color="A0BDD4" w:sz="1"/>
-              <w:right w:val="single" w:color="A0BDD4" w:sz="1"/>
-            </w:tcBorders>
-            <w:shd w:fill="EEF4FB" w:val="clear"/>
-            <w:tcMar>
-              <w:top w:type="dxa" w:w="80"/>
-              <w:left w:type="dxa" w:w="120"/>
-              <w:bottom w:type="dxa" w:w="80"/>
-              <w:right w:type="dxa" w:w="120"/>
-            </w:tcMar>
-          </w:tcPr>
-          <w:p>
-            <w:r>
-              <w:rPr>
-                <w:rFonts w:ascii="Arial" w:cs="Arial" w:eastAsia="Arial" w:hAnsi="Arial"/>
-                <w:sz w:val="18"/>
-                <w:szCs w:val="18"/>
-              </w:rPr>
-              <w:t xml:space="preserve">Machine timer compare. When MTIME &gt;= MTIMECMP, asserts IRQ on CPU line 7. Write a new future value to clear the interrupt.</w:t>
-            </w:r>
-          </w:p>
-        </w:tc>
-      </w:tr>
-      <w:tr>
-        <w:tc>
-          <w:tcPr>
-            <w:tcW w:type="dxa" w:w="1200"/>
-            <w:tcBorders>
-              <w:top w:val="single" w:color="A0BDD4" w:sz="1"/>
-              <w:left w:val="single" w:color="A0BDD4" w:sz="1"/>
-              <w:bottom w:val="single" w:color="A0BDD4" w:sz="1"/>
-              <w:right w:val="single" w:color="A0BDD4" w:sz="1"/>
-            </w:tcBorders>
-            <w:shd w:fill="FFFFFF" w:val="clear"/>
-            <w:tcMar>
-              <w:top w:type="dxa" w:w="80"/>
-              <w:left w:type="dxa" w:w="120"/>
-              <w:bottom w:type="dxa" w:w="80"/>
-              <w:right w:type="dxa" w:w="120"/>
-            </w:tcMar>
-          </w:tcPr>
-          <w:p>
-            <w:r>
-              <w:rPr>
-                <w:rFonts w:ascii="Courier New" w:cs="Courier New" w:eastAsia="Courier New" w:hAnsi="Courier New"/>
-                <w:sz w:val="18"/>
-                <w:szCs w:val="18"/>
-              </w:rPr>
-              <w:t xml:space="preserve">0xBFF8</w:t>
-            </w:r>
-          </w:p>
-        </w:tc>
-        <w:tc>
-          <w:tcPr>
-            <w:tcW w:type="dxa" w:w="1680"/>
-            <w:tcBorders>
-              <w:top w:val="single" w:color="A0BDD4" w:sz="1"/>
-              <w:left w:val="single" w:color="A0BDD4" w:sz="1"/>
-              <w:bottom w:val="single" w:color="A0BDD4" w:sz="1"/>
-              <w:right w:val="single" w:color="A0BDD4" w:sz="1"/>
-            </w:tcBorders>
-            <w:shd w:fill="FFFFFF" w:val="clear"/>
-            <w:tcMar>
-              <w:top w:type="dxa" w:w="80"/>
-              <w:left w:type="dxa" w:w="120"/>
-              <w:bottom w:type="dxa" w:w="80"/>
-              <w:right w:type="dxa" w:w="120"/>
-            </w:tcMar>
-          </w:tcPr>
-          <w:p>
-            <w:r>
-              <w:rPr>
-                <w:rFonts w:ascii="Arial" w:cs="Arial" w:eastAsia="Arial" w:hAnsi="Arial"/>
-                <w:sz w:val="18"/>
-                <w:szCs w:val="18"/>
-              </w:rPr>
-              <w:t xml:space="preserve">MTIME</w:t>
-            </w:r>
-          </w:p>
-        </w:tc>
-        <w:tc>
-          <w:tcPr>
-            <w:tcW w:type="dxa" w:w="960"/>
-            <w:tcBorders>
-              <w:top w:val="single" w:color="A0BDD4" w:sz="1"/>
-              <w:left w:val="single" w:color="A0BDD4" w:sz="1"/>
-              <w:bottom w:val="single" w:color="A0BDD4" w:sz="1"/>
-              <w:right w:val="single" w:color="A0BDD4" w:sz="1"/>
-            </w:tcBorders>
-            <w:shd w:fill="FFFFFF" w:val="clear"/>
-            <w:tcMar>
-              <w:top w:type="dxa" w:w="80"/>
-              <w:left w:type="dxa" w:w="120"/>
-              <w:bottom w:type="dxa" w:w="80"/>
-              <w:right w:type="dxa" w:w="120"/>
-            </w:tcMar>
-          </w:tcPr>
-          <w:p>
-            <w:r>
-              <w:rPr>
-                <w:rFonts w:ascii="Arial" w:cs="Arial" w:eastAsia="Arial" w:hAnsi="Arial"/>
-                <w:sz w:val="18"/>
-                <w:szCs w:val="18"/>
-              </w:rPr>
-              <w:t xml:space="preserve">64-bit</w:t>
-            </w:r>
-          </w:p>
-        </w:tc>
-        <w:tc>
-          <w:tcPr>
-            <w:tcW w:type="dxa" w:w="960"/>
-            <w:tcBorders>
-              <w:top w:val="single" w:color="A0BDD4" w:sz="1"/>
-              <w:left w:val="single" w:color="A0BDD4" w:sz="1"/>
-              <w:bottom w:val="single" w:color="A0BDD4" w:sz="1"/>
-              <w:right w:val="single" w:color="A0BDD4" w:sz="1"/>
-            </w:tcBorders>
-            <w:shd w:fill="FFFFFF" w:val="clear"/>
-            <w:tcMar>
-              <w:top w:type="dxa" w:w="80"/>
-              <w:left w:type="dxa" w:w="120"/>
-              <w:bottom w:type="dxa" w:w="80"/>
-              <w:right w:type="dxa" w:w="120"/>
-            </w:tcMar>
-          </w:tcPr>
-          <w:p>
-            <w:r>
-              <w:rPr>
-                <w:rFonts w:ascii="Arial" w:cs="Arial" w:eastAsia="Arial" w:hAnsi="Arial"/>
-                <w:sz w:val="18"/>
-                <w:szCs w:val="18"/>
-              </w:rPr>
-              <w:t xml:space="preserve">R</w:t>
-            </w:r>
-          </w:p>
-        </w:tc>
-        <w:tc>
-          <w:tcPr>
-            <w:tcW w:type="dxa" w:w="4280"/>
-            <w:tcBorders>
-              <w:top w:val="single" w:color="A0BDD4" w:sz="1"/>
-              <w:left w:val="single" w:color="A0BDD4" w:sz="1"/>
-              <w:bottom w:val="single" w:color="A0BDD4" w:sz="1"/>
-              <w:right w:val="single" w:color="A0BDD4" w:sz="1"/>
-            </w:tcBorders>
-            <w:shd w:fill="FFFFFF" w:val="clear"/>
-            <w:tcMar>
-              <w:top w:type="dxa" w:w="80"/>
-              <w:left w:type="dxa" w:w="120"/>
-              <w:bottom w:type="dxa" w:w="80"/>
-              <w:right w:type="dxa" w:w="120"/>
-            </w:tcMar>
-          </w:tcPr>
-          <w:p>
-            <w:r>
-              <w:rPr>
-                <w:rFonts w:ascii="Arial" w:cs="Arial" w:eastAsia="Arial" w:hAnsi="Arial"/>
-                <w:sz w:val="18"/>
-                <w:szCs w:val="18"/>
-              </w:rPr>
-              <w:t xml:space="preserve">Current machine time in timer ticks (100 MHz). Always increasing; not writable.</w:t>
-            </w:r>
-          </w:p>
-        </w:tc>
-      </w:tr>
-    </w:tbl>
-    <w:p>
-      <w:pPr>
-        <w:spacing w:after="0" w:before="120"/>
-      </w:pPr>
-    </w:p>
-    <w:p>
-      <w:pPr>
-        <w:pStyle w:val="Heading2"/>
-        <w:spacing w:after="120" w:before="240"/>
-      </w:pPr>
-      <w:r>
-        <w:rPr>
-          <w:rFonts w:ascii="Arial" w:cs="Arial" w:eastAsia="Arial" w:hAnsi="Arial"/>
-          <w:b/>
-          <w:bCs/>
-          <w:color w:val="000000"/>
-          <w:sz w:val="26"/>
-          <w:szCs w:val="26"/>
-        </w:rPr>
-        <w:t xml:space="preserve">7.1  Set a Timer Interrupt 1 Second from Now</w:t>
-      </w:r>
-    </w:p>
-    <w:p>
-      <w:pPr>
-        <w:shd w:fill="F2F2F2" w:val="clear"/>
-        <w:spacing w:after="60" w:before="60"/>
-        <w:ind w:left="360"/>
-      </w:pPr>
-      <w:r>
-        <w:rPr>
-          <w:rFonts w:ascii="Courier New" w:cs="Courier New" w:eastAsia="Courier New" w:hAnsi="Courier New"/>
-          <w:sz w:val="17"/>
-          <w:szCs w:val="17"/>
-        </w:rPr>
-        <w:t xml:space="preserve">    li   t0, 0xe0005000</w:t>
-      </w:r>
-    </w:p>
-    <w:p>
-      <w:pPr>
-        <w:shd w:fill="F2F2F2" w:val="clear"/>
-        <w:spacing w:after="60" w:before="60"/>
-        <w:ind w:left="360"/>
-      </w:pPr>
-      <w:r>
-        <w:rPr>
-          <w:rFonts w:ascii="Courier New" w:cs="Courier New" w:eastAsia="Courier New" w:hAnsi="Courier New"/>
-          <w:sz w:val="17"/>
-          <w:szCs w:val="17"/>
-        </w:rPr>
-        <w:t xml:space="preserve">    # Read current MTIME (low 32 bits)</w:t>
-      </w:r>
-    </w:p>
-    <w:p>
-      <w:pPr>
-        <w:shd w:fill="F2F2F2" w:val="clear"/>
-        <w:spacing w:after="60" w:before="60"/>
-        <w:ind w:left="360"/>
-      </w:pPr>
-      <w:r>
-        <w:rPr>
-          <w:rFonts w:ascii="Courier New" w:cs="Courier New" w:eastAsia="Courier New" w:hAnsi="Courier New"/>
-          <w:sz w:val="17"/>
-          <w:szCs w:val="17"/>
-        </w:rPr>
-        <w:t xml:space="preserve">    lw   t1, 0xBFF8(t0)</w:t>
-      </w:r>
-    </w:p>
-    <w:p>
-      <w:pPr>
-        <w:shd w:fill="F2F2F2" w:val="clear"/>
-        <w:spacing w:after="60" w:before="60"/>
-        <w:ind w:left="360"/>
-      </w:pPr>
-      <w:r>
-        <w:rPr>
-          <w:rFonts w:ascii="Courier New" w:cs="Courier New" w:eastAsia="Courier New" w:hAnsi="Courier New"/>
-          <w:sz w:val="17"/>
-          <w:szCs w:val="17"/>
-        </w:rPr>
-        <w:t xml:space="preserve">    # Add 100,000,000 ticks (1 second at 100 MHz)</w:t>
-      </w:r>
-    </w:p>
-    <w:p>
-      <w:pPr>
-        <w:shd w:fill="F2F2F2" w:val="clear"/>
-        <w:spacing w:after="60" w:before="60"/>
-        <w:ind w:left="360"/>
-      </w:pPr>
-      <w:r>
-        <w:rPr>
-          <w:rFonts w:ascii="Courier New" w:cs="Courier New" w:eastAsia="Courier New" w:hAnsi="Courier New"/>
-          <w:sz w:val="17"/>
-          <w:szCs w:val="17"/>
-        </w:rPr>
-        <w:t xml:space="preserve">    li   t2, 100000000</w:t>
-      </w:r>
-    </w:p>
-    <w:p>
-      <w:pPr>
-        <w:shd w:fill="F2F2F2" w:val="clear"/>
-        <w:spacing w:after="60" w:before="60"/>
-        <w:ind w:left="360"/>
-      </w:pPr>
-      <w:r>
-        <w:rPr>
-          <w:rFonts w:ascii="Courier New" w:cs="Courier New" w:eastAsia="Courier New" w:hAnsi="Courier New"/>
-          <w:sz w:val="17"/>
-          <w:szCs w:val="17"/>
-        </w:rPr>
-        <w:t xml:space="preserve">    add  t1, t1, t2</w:t>
-      </w:r>
-    </w:p>
-    <w:p>
-      <w:pPr>
-        <w:shd w:fill="F2F2F2" w:val="clear"/>
-        <w:spacing w:after="60" w:before="60"/>
-        <w:ind w:left="360"/>
-      </w:pPr>
-      <w:r>
-        <w:rPr>
-          <w:rFonts w:ascii="Courier New" w:cs="Courier New" w:eastAsia="Courier New" w:hAnsi="Courier New"/>
-          <w:sz w:val="17"/>
-          <w:szCs w:val="17"/>
-        </w:rPr>
-        <w:t xml:space="preserve">    # Write to MTIMECMP (low word; high word = 0 for simplicity)</w:t>
-      </w:r>
-    </w:p>
-    <w:p>
-      <w:pPr>
-        <w:shd w:fill="F2F2F2" w:val="clear"/>
-        <w:spacing w:after="60" w:before="60"/>
-        <w:ind w:left="360"/>
-      </w:pPr>
-      <w:r>
-        <w:rPr>
-          <w:rFonts w:ascii="Courier New" w:cs="Courier New" w:eastAsia="Courier New" w:hAnsi="Courier New"/>
-          <w:sz w:val="17"/>
-          <w:szCs w:val="17"/>
-        </w:rPr>
-        <w:t xml:space="preserve">    sw   t1,  0x4000(t0)</w:t>
-      </w:r>
-    </w:p>
-    <w:p>
-      <w:pPr>
-        <w:shd w:fill="F2F2F2" w:val="clear"/>
-        <w:spacing w:after="60" w:before="60"/>
-        <w:ind w:left="360"/>
-      </w:pPr>
-      <w:r>
-        <w:rPr>
-          <w:rFonts w:ascii="Courier New" w:cs="Courier New" w:eastAsia="Courier New" w:hAnsi="Courier New"/>
-          <w:sz w:val="17"/>
-          <w:szCs w:val="17"/>
-        </w:rPr>
-        <w:t xml:space="preserve">    sw   zero, 0x4004(t0)</w:t>
+        <w:t xml:space="preserve">Using cs281.inc: the equates TIMER_BASE, TIMER_LOAD0–LOAD3, TIMER_RELOAD0–RELOAD3, TIMER_EN, TIMER_EV_PENDING, and TIMER_EV_ENABLE are all defined in hardware/lib/cs281.inc. Pre-computed byte slices of TIMER_FREQ (TIMER_FREQ_B0–B3) are also available.</w:t>
       </w:r>
     </w:p>
     <w:p>
       <w:pPr>
         <w:spacing w:after="0" w:before="80"/>
       </w:pPr>
-    </w:p>
-    <w:p>
-      <w:pPr>
-        <w:spacing w:after="80" w:before="80"/>
-        <w:ind w:left="360"/>
-      </w:pPr>
-      <w:r>
-        <w:rPr>
-          <w:b/>
-          <w:bCs/>
-          <w:color w:val="2E75B6"/>
-          <w:sz w:val="18"/>
-          <w:szCs w:val="18"/>
-        </w:rPr>
-        <w:t xml:space="preserve">NOTE  </w:t>
-      </w:r>
-      <w:r>
-        <w:rPr>
-          <w:i/>
-          <w:iCs/>
-          <w:sz w:val="18"/>
-          <w:szCs w:val="18"/>
-        </w:rPr>
-        <w:t xml:space="preserve">Always write MTIMECMP high word before low word when using 64-bit compare to avoid spurious interrupts during the two-word write.</w:t>
-      </w:r>
     </w:p>
     <w:p>
       <w:pPr>
@@ -14773,7 +15244,7 @@
                 <w:sz w:val="18"/>
                 <w:szCs w:val="18"/>
               </w:rPr>
-              <w:t xml:space="preserve">Timer load value</w:t>
+              <w:t xml:space="preserve">Load value MSB byte (LOAD0). Write LOAD0-3 MSB-first. See Section 6.</w:t>
             </w:r>
           </w:p>
         </w:tc>
@@ -14887,7 +15358,7 @@
                 <w:sz w:val="18"/>
                 <w:szCs w:val="18"/>
               </w:rPr>
-              <w:t xml:space="preserve">Timer auto-reload (0 = one-shot)</w:t>
+              <w:t xml:space="preserve">Reload value MSB byte (RELOAD0). Write RELOAD0-3 MSB-first. See Section 6.</w:t>
             </w:r>
           </w:p>
         </w:tc>
@@ -14917,7 +15388,7 @@
                 <w:sz w:val="18"/>
                 <w:szCs w:val="18"/>
               </w:rPr>
-              <w:t xml:space="preserve">0xe0002008</w:t>
+              <w:t xml:space="preserve">0xe0002020</w:t>
             </w:r>
           </w:p>
         </w:tc>
@@ -15031,7 +15502,7 @@
                 <w:sz w:val="18"/>
                 <w:szCs w:val="18"/>
               </w:rPr>
-              <w:t xml:space="preserve">0xe000200C</w:t>
+              <w:t xml:space="preserve">0xe0002024</w:t>
             </w:r>
           </w:p>
         </w:tc>
@@ -15115,7 +15586,7 @@
                 <w:sz w:val="18"/>
                 <w:szCs w:val="18"/>
               </w:rPr>
-              <w:t xml:space="preserve">Write 1 to latch VALUE</w:t>
+              <w:t xml:space="preserve">Write 1 to latch current count into VALUE sub-registers.</w:t>
             </w:r>
           </w:p>
         </w:tc>
@@ -15145,7 +15616,7 @@
                 <w:sz w:val="18"/>
                 <w:szCs w:val="18"/>
               </w:rPr>
-              <w:t xml:space="preserve">0xe0002010</w:t>
+              <w:t xml:space="preserve">0xe0002028</w:t>
             </w:r>
           </w:p>
         </w:tc>
@@ -15259,7 +15730,7 @@
                 <w:sz w:val="18"/>
                 <w:szCs w:val="18"/>
               </w:rPr>
-              <w:t xml:space="preserve">0xe0002018</w:t>
+              <w:t xml:space="preserve">0xe000203C</w:t>
             </w:r>
           </w:p>
         </w:tc>
@@ -15373,7 +15844,7 @@
                 <w:sz w:val="18"/>
                 <w:szCs w:val="18"/>
               </w:rPr>
-              <w:t xml:space="preserve">0xe000201C</w:t>
+              <w:t xml:space="preserve">0xe0002040</w:t>
             </w:r>
           </w:p>
         </w:tc>

</xml_diff>